<commit_message>
Dodano rozdział o sterowaniu
</commit_message>
<xml_diff>
--- a/Dokumentacja/DOKUMENTACJA UŻYTKOWA.docx
+++ b/Dokumentacja/DOKUMENTACJA UŻYTKOWA.docx
@@ -280,11 +280,11 @@
             </w:tabs>
             <w:spacing w:after="100" w:line="278" w:lineRule="auto"/>
             <w:rPr>
-              <w:rFonts w:ascii="Calibri" w:hAnsi="Calibri" w:eastAsia="等线" w:cs="Times New Roman"/>
+              <w:rFonts w:ascii="Calibri" w:hAnsi="Calibri" w:eastAsia="Calibri" w:cs="Times New Roman"/>
               <w:kern w:val="2"/>
               <w:sz w:val="24"/>
               <w:szCs w:val="24"/>
-              <w:lang w:val="pl-PL" w:eastAsia="pl-PL" w:bidi="ar-SA"/>
+              <w:lang w:val="pl-PL" w:eastAsia="en-US" w:bidi="ar-SA"/>
               <w14:ligatures w14:val="standardContextual"/>
             </w:rPr>
           </w:pPr>
@@ -477,7 +477,7 @@
             </w:tabs>
             <w:spacing w:after="100" w:line="278" w:lineRule="auto"/>
             <w:rPr>
-              <w:rFonts w:ascii="Calibri" w:hAnsi="Calibri" w:eastAsia="等线" w:cs="Times New Roman"/>
+              <w:rFonts w:ascii="Calibri" w:hAnsi="Calibri" w:eastAsia="Calibri" w:cs="Times New Roman"/>
               <w:kern w:val="2"/>
               <w:sz w:val="24"/>
               <w:szCs w:val="24"/>
@@ -505,7 +505,7 @@
               <w:lang w:val="pl-PL" w:eastAsia="en-US" w:bidi="ar-SA"/>
               <w14:ligatures w14:val="standardContextual"/>
             </w:rPr>
-            <w:instrText xml:space="preserve"> HYPERLINK \l "_Toc212571957" </w:instrText>
+            <w:instrText xml:space="preserve"> HYPERLINK \l "_Toc212571956" </w:instrText>
           </w:r>
           <w:r>
             <w:rPr>
@@ -520,6 +520,17 @@
           </w:r>
           <w:r>
             <w:rPr>
+              <w:rFonts w:hint="default" w:ascii="Calibri" w:hAnsi="Calibri" w:eastAsia="Calibri" w:cs="Times New Roman"/>
+              <w:kern w:val="2"/>
+              <w:sz w:val="24"/>
+              <w:szCs w:val="24"/>
+              <w:lang w:val="pl-PL" w:eastAsia="en-US" w:bidi="ar-SA"/>
+              <w14:ligatures w14:val="standardContextual"/>
+            </w:rPr>
+            <w:t>2</w:t>
+          </w:r>
+          <w:r>
+            <w:rPr>
               <w:rFonts w:ascii="Calibri" w:hAnsi="Calibri" w:eastAsia="Calibri" w:cs="Times New Roman"/>
               <w:color w:val="0563C1"/>
               <w:kern w:val="2"/>
@@ -529,7 +540,7 @@
               <w:lang w:val="pl-PL" w:eastAsia="en-US" w:bidi="ar-SA"/>
               <w14:ligatures w14:val="standardContextual"/>
             </w:rPr>
-            <w:t>2.</w:t>
+            <w:t>.</w:t>
           </w:r>
           <w:r>
             <w:rPr>
@@ -553,7 +564,7 @@
               <w:lang w:val="pl-PL" w:eastAsia="en-US" w:bidi="ar-SA"/>
               <w14:ligatures w14:val="standardContextual"/>
             </w:rPr>
-            <w:t>Mechaniki gry</w:t>
+            <w:t>Sterowanie</w:t>
           </w:r>
           <w:r>
             <w:rPr>
@@ -625,6 +636,137 @@
               <w:lang w:val="pl-PL" w:eastAsia="en-US" w:bidi="ar-SA"/>
               <w14:ligatures w14:val="standardContextual"/>
             </w:rPr>
+            <w:instrText xml:space="preserve"> HYPERLINK \l "_Toc212571957" </w:instrText>
+          </w:r>
+          <w:r>
+            <w:rPr>
+              <w:rFonts w:ascii="Calibri" w:hAnsi="Calibri" w:eastAsia="Calibri" w:cs="Times New Roman"/>
+              <w:kern w:val="2"/>
+              <w:sz w:val="24"/>
+              <w:szCs w:val="24"/>
+              <w:lang w:val="pl-PL" w:eastAsia="en-US" w:bidi="ar-SA"/>
+              <w14:ligatures w14:val="standardContextual"/>
+            </w:rPr>
+            <w:fldChar w:fldCharType="separate"/>
+          </w:r>
+          <w:r>
+            <w:rPr>
+              <w:rFonts w:hint="default" w:ascii="Calibri" w:hAnsi="Calibri" w:eastAsia="Calibri" w:cs="Times New Roman"/>
+              <w:kern w:val="2"/>
+              <w:sz w:val="24"/>
+              <w:szCs w:val="24"/>
+              <w:lang w:val="pl-PL" w:eastAsia="en-US" w:bidi="ar-SA"/>
+              <w14:ligatures w14:val="standardContextual"/>
+            </w:rPr>
+            <w:t>3</w:t>
+          </w:r>
+          <w:r>
+            <w:rPr>
+              <w:rFonts w:ascii="Calibri" w:hAnsi="Calibri" w:eastAsia="Calibri" w:cs="Times New Roman"/>
+              <w:color w:val="0563C1"/>
+              <w:kern w:val="2"/>
+              <w:sz w:val="24"/>
+              <w:szCs w:val="24"/>
+              <w:u w:val="single"/>
+              <w:lang w:val="pl-PL" w:eastAsia="en-US" w:bidi="ar-SA"/>
+              <w14:ligatures w14:val="standardContextual"/>
+            </w:rPr>
+            <w:t>.</w:t>
+          </w:r>
+          <w:r>
+            <w:rPr>
+              <w:rFonts w:ascii="Calibri" w:hAnsi="Calibri" w:eastAsia="等线" w:cs="Times New Roman"/>
+              <w:kern w:val="2"/>
+              <w:sz w:val="24"/>
+              <w:szCs w:val="24"/>
+              <w:lang w:val="pl-PL" w:eastAsia="pl-PL" w:bidi="ar-SA"/>
+              <w14:ligatures w14:val="standardContextual"/>
+            </w:rPr>
+            <w:tab/>
+          </w:r>
+          <w:r>
+            <w:rPr>
+              <w:rFonts w:hint="default" w:ascii="Calibri" w:hAnsi="Calibri" w:eastAsia="Calibri" w:cs="Times New Roman"/>
+              <w:color w:val="0563C1"/>
+              <w:kern w:val="2"/>
+              <w:sz w:val="24"/>
+              <w:szCs w:val="24"/>
+              <w:u w:val="single"/>
+              <w:lang w:val="pl-PL" w:eastAsia="en-US" w:bidi="ar-SA"/>
+              <w14:ligatures w14:val="standardContextual"/>
+            </w:rPr>
+            <w:t>Mechaniki gry</w:t>
+          </w:r>
+          <w:r>
+            <w:rPr>
+              <w:rFonts w:ascii="Calibri" w:hAnsi="Calibri" w:eastAsia="Calibri" w:cs="Times New Roman"/>
+              <w:kern w:val="2"/>
+              <w:sz w:val="24"/>
+              <w:szCs w:val="24"/>
+              <w:lang w:val="pl-PL" w:eastAsia="en-US" w:bidi="ar-SA"/>
+              <w14:ligatures w14:val="standardContextual"/>
+            </w:rPr>
+            <w:tab/>
+          </w:r>
+          <w:r>
+            <w:rPr>
+              <w:rFonts w:hint="default" w:ascii="Calibri" w:hAnsi="Calibri" w:eastAsia="Calibri" w:cs="Times New Roman"/>
+              <w:kern w:val="2"/>
+              <w:sz w:val="24"/>
+              <w:szCs w:val="24"/>
+              <w:lang w:val="pl-PL" w:eastAsia="en-US" w:bidi="ar-SA"/>
+              <w14:ligatures w14:val="standardContextual"/>
+            </w:rPr>
+            <w:t>5</w:t>
+          </w:r>
+          <w:r>
+            <w:rPr>
+              <w:rFonts w:ascii="Calibri" w:hAnsi="Calibri" w:eastAsia="Calibri" w:cs="Times New Roman"/>
+              <w:kern w:val="2"/>
+              <w:sz w:val="24"/>
+              <w:szCs w:val="24"/>
+              <w:lang w:val="pl-PL" w:eastAsia="en-US" w:bidi="ar-SA"/>
+              <w14:ligatures w14:val="standardContextual"/>
+            </w:rPr>
+            <w:fldChar w:fldCharType="end"/>
+          </w:r>
+        </w:p>
+        <w:p>
+          <w:pPr>
+            <w:tabs>
+              <w:tab w:val="left" w:pos="480"/>
+              <w:tab w:val="right" w:leader="dot" w:pos="10456"/>
+            </w:tabs>
+            <w:spacing w:after="100" w:line="278" w:lineRule="auto"/>
+            <w:rPr>
+              <w:rFonts w:ascii="Calibri" w:hAnsi="Calibri" w:eastAsia="等线" w:cs="Times New Roman"/>
+              <w:kern w:val="2"/>
+              <w:sz w:val="24"/>
+              <w:szCs w:val="24"/>
+              <w:lang w:val="pl-PL" w:eastAsia="pl-PL" w:bidi="ar-SA"/>
+              <w14:ligatures w14:val="standardContextual"/>
+            </w:rPr>
+          </w:pPr>
+          <w:r>
+            <w:rPr>
+              <w:rFonts w:ascii="Calibri" w:hAnsi="Calibri" w:eastAsia="Calibri" w:cs="Times New Roman"/>
+              <w:kern w:val="2"/>
+              <w:sz w:val="24"/>
+              <w:szCs w:val="24"/>
+              <w:lang w:val="pl-PL" w:eastAsia="en-US" w:bidi="ar-SA"/>
+              <w14:ligatures w14:val="standardContextual"/>
+            </w:rPr>
+            <w:fldChar w:fldCharType="begin"/>
+          </w:r>
+          <w:r>
+            <w:rPr>
+              <w:rFonts w:ascii="Calibri" w:hAnsi="Calibri" w:eastAsia="Calibri" w:cs="Times New Roman"/>
+              <w:kern w:val="2"/>
+              <w:sz w:val="24"/>
+              <w:szCs w:val="24"/>
+              <w:lang w:val="pl-PL" w:eastAsia="en-US" w:bidi="ar-SA"/>
+              <w14:ligatures w14:val="standardContextual"/>
+            </w:rPr>
             <w:instrText xml:space="preserve"> HYPERLINK \l "_Toc212571958" </w:instrText>
           </w:r>
           <w:r>
@@ -640,6 +782,17 @@
           </w:r>
           <w:r>
             <w:rPr>
+              <w:rFonts w:hint="default" w:ascii="Calibri" w:hAnsi="Calibri" w:eastAsia="Calibri" w:cs="Times New Roman"/>
+              <w:kern w:val="2"/>
+              <w:sz w:val="24"/>
+              <w:szCs w:val="24"/>
+              <w:lang w:val="pl-PL" w:eastAsia="en-US" w:bidi="ar-SA"/>
+              <w14:ligatures w14:val="standardContextual"/>
+            </w:rPr>
+            <w:t>4</w:t>
+          </w:r>
+          <w:r>
+            <w:rPr>
               <w:rFonts w:ascii="Calibri" w:hAnsi="Calibri" w:eastAsia="Calibri" w:cs="Times New Roman"/>
               <w:color w:val="0563C1"/>
               <w:kern w:val="2"/>
@@ -649,7 +802,7 @@
               <w:lang w:val="pl-PL" w:eastAsia="en-US" w:bidi="ar-SA"/>
               <w14:ligatures w14:val="standardContextual"/>
             </w:rPr>
-            <w:t>3.</w:t>
+            <w:t>.</w:t>
           </w:r>
           <w:r>
             <w:rPr>
@@ -760,6 +913,17 @@
           </w:r>
           <w:r>
             <w:rPr>
+              <w:rFonts w:hint="default" w:ascii="Calibri" w:hAnsi="Calibri" w:eastAsia="Calibri" w:cs="Times New Roman"/>
+              <w:kern w:val="2"/>
+              <w:sz w:val="24"/>
+              <w:szCs w:val="24"/>
+              <w:lang w:val="pl-PL" w:eastAsia="en-US" w:bidi="ar-SA"/>
+              <w14:ligatures w14:val="standardContextual"/>
+            </w:rPr>
+            <w:t>5</w:t>
+          </w:r>
+          <w:r>
+            <w:rPr>
               <w:rFonts w:ascii="Calibri" w:hAnsi="Calibri" w:eastAsia="Calibri" w:cs="Times New Roman"/>
               <w:color w:val="0563C1"/>
               <w:kern w:val="2"/>
@@ -769,7 +933,7 @@
               <w:lang w:val="pl-PL" w:eastAsia="en-US" w:bidi="ar-SA"/>
               <w14:ligatures w14:val="standardContextual"/>
             </w:rPr>
-            <w:t>4.</w:t>
+            <w:t>.</w:t>
           </w:r>
           <w:r>
             <w:rPr>
@@ -896,8 +1060,6 @@
         </w:rPr>
         <w:br w:type="page"/>
       </w:r>
-      <w:bookmarkStart w:id="0" w:name="_GoBack"/>
-      <w:bookmarkEnd w:id="0"/>
     </w:p>
     <w:p>
       <w:pPr>
@@ -2381,16 +2543,6 @@
     </w:p>
     <w:p>
       <w:pPr>
-        <w:rPr>
-          <w:rFonts w:hint="default" w:cs="Times New Roman" w:asciiTheme="minorAscii" w:hAnsiTheme="minorAscii"/>
-          <w:sz w:val="28"/>
-          <w:szCs w:val="28"/>
-          <w:lang w:val="pl-PL"/>
-        </w:rPr>
-      </w:pPr>
-    </w:p>
-    <w:p>
-      <w:pPr>
         <w:numPr>
           <w:ilvl w:val="0"/>
           <w:numId w:val="1"/>
@@ -2416,7 +2568,182 @@
           <w:lang w:val="pl-PL" w:eastAsia="en-US" w:bidi="ar-SA"/>
           <w14:ligatures w14:val="standardContextual"/>
         </w:rPr>
-        <w:t>Mechaniki gry</w:t>
+        <w:t>Sterowanie</w:t>
+      </w:r>
+    </w:p>
+    <w:p>
+      <w:pPr>
+        <w:numPr>
+          <w:numId w:val="0"/>
+        </w:numPr>
+        <w:ind w:leftChars="0"/>
+        <w:rPr>
+          <w:rFonts w:hint="default" w:ascii="Calibri" w:hAnsi="Calibri" w:eastAsia="等线 Light" w:cs="Calibri"/>
+          <w:b w:val="0"/>
+          <w:bCs w:val="0"/>
+          <w:color w:val="auto"/>
+          <w:kern w:val="2"/>
+          <w:sz w:val="28"/>
+          <w:szCs w:val="28"/>
+          <w:lang w:val="pl-PL" w:eastAsia="en-US" w:bidi="ar-SA"/>
+          <w14:ligatures w14:val="standardContextual"/>
+        </w:rPr>
+      </w:pPr>
+      <w:r>
+        <w:rPr>
+          <w:rFonts w:hint="default" w:ascii="Calibri" w:hAnsi="Calibri" w:eastAsia="等线 Light" w:cs="Calibri"/>
+          <w:b w:val="0"/>
+          <w:bCs w:val="0"/>
+          <w:color w:val="auto"/>
+          <w:kern w:val="2"/>
+          <w:sz w:val="28"/>
+          <w:szCs w:val="28"/>
+          <w:lang w:val="pl-PL" w:eastAsia="en-US" w:bidi="ar-SA"/>
+          <w14:ligatures w14:val="standardContextual"/>
+        </w:rPr>
+        <w:t>Gra w całości polega na sterowaniu myszką oraz wciskaniu elementów za pomocą lewego przycisku myszy.</w:t>
+      </w:r>
+    </w:p>
+    <w:p>
+      <w:pPr>
+        <w:numPr>
+          <w:numId w:val="0"/>
+        </w:numPr>
+        <w:ind w:leftChars="0"/>
+        <w:rPr>
+          <w:rFonts w:hint="default" w:ascii="Calibri" w:hAnsi="Calibri" w:eastAsia="等线 Light" w:cs="Calibri"/>
+          <w:b w:val="0"/>
+          <w:bCs w:val="0"/>
+          <w:color w:val="auto"/>
+          <w:kern w:val="2"/>
+          <w:sz w:val="28"/>
+          <w:szCs w:val="28"/>
+          <w:lang w:val="pl-PL" w:eastAsia="en-US" w:bidi="ar-SA"/>
+          <w14:ligatures w14:val="standardContextual"/>
+        </w:rPr>
+      </w:pPr>
+    </w:p>
+    <w:p>
+      <w:pPr>
+        <w:numPr>
+          <w:numId w:val="0"/>
+        </w:numPr>
+        <w:ind w:leftChars="0"/>
+        <w:rPr>
+          <w:rFonts w:hint="default" w:ascii="Calibri" w:hAnsi="Calibri" w:eastAsia="等线 Light" w:cs="Calibri"/>
+          <w:b w:val="0"/>
+          <w:bCs w:val="0"/>
+          <w:color w:val="auto"/>
+          <w:kern w:val="2"/>
+          <w:sz w:val="28"/>
+          <w:szCs w:val="28"/>
+          <w:lang w:val="pl-PL" w:eastAsia="en-US" w:bidi="ar-SA"/>
+          <w14:ligatures w14:val="standardContextual"/>
+        </w:rPr>
+      </w:pPr>
+      <w:r>
+        <w:rPr>
+          <w:rFonts w:hint="default" w:ascii="Calibri" w:hAnsi="Calibri" w:eastAsia="等线 Light" w:cs="Calibri"/>
+          <w:b w:val="0"/>
+          <w:bCs w:val="0"/>
+          <w:color w:val="auto"/>
+          <w:kern w:val="2"/>
+          <w:sz w:val="28"/>
+          <w:szCs w:val="28"/>
+          <w:lang w:val="pl-PL" w:eastAsia="en-US" w:bidi="ar-SA"/>
+          <w14:ligatures w14:val="standardContextual"/>
+        </w:rPr>
+        <w:t xml:space="preserve">W główny obiekt można kliknąć na trzy sposoby </w:t>
+      </w:r>
+    </w:p>
+    <w:p>
+      <w:pPr>
+        <w:numPr>
+          <w:ilvl w:val="0"/>
+          <w:numId w:val="2"/>
+        </w:numPr>
+        <w:ind w:left="425" w:leftChars="0" w:hanging="425" w:firstLineChars="0"/>
+        <w:rPr>
+          <w:rFonts w:hint="default" w:eastAsia="等线 Light" w:cs="Times New Roman" w:asciiTheme="minorAscii" w:hAnsiTheme="minorAscii"/>
+          <w:color w:val="auto"/>
+          <w:kern w:val="2"/>
+          <w:sz w:val="28"/>
+          <w:szCs w:val="28"/>
+          <w:lang w:val="pl-PL" w:eastAsia="en-US" w:bidi="ar-SA"/>
+          <w14:ligatures w14:val="standardContextual"/>
+        </w:rPr>
+      </w:pPr>
+      <w:r>
+        <w:rPr>
+          <w:rFonts w:hint="default" w:eastAsia="等线 Light" w:cs="Times New Roman" w:asciiTheme="minorAscii" w:hAnsiTheme="minorAscii"/>
+          <w:color w:val="auto"/>
+          <w:kern w:val="2"/>
+          <w:sz w:val="28"/>
+          <w:szCs w:val="28"/>
+          <w:lang w:val="pl-PL" w:eastAsia="en-US" w:bidi="ar-SA"/>
+          <w14:ligatures w14:val="standardContextual"/>
+        </w:rPr>
+        <w:t>Wciśnięcie klawisza enter</w:t>
+      </w:r>
+    </w:p>
+    <w:p>
+      <w:pPr>
+        <w:numPr>
+          <w:ilvl w:val="0"/>
+          <w:numId w:val="2"/>
+        </w:numPr>
+        <w:ind w:left="425" w:leftChars="0" w:hanging="425" w:firstLineChars="0"/>
+        <w:rPr>
+          <w:rFonts w:hint="default" w:eastAsia="等线 Light" w:cs="Times New Roman" w:asciiTheme="minorAscii" w:hAnsiTheme="minorAscii"/>
+          <w:color w:val="auto"/>
+          <w:kern w:val="2"/>
+          <w:sz w:val="28"/>
+          <w:szCs w:val="28"/>
+          <w:lang w:val="pl-PL" w:eastAsia="en-US" w:bidi="ar-SA"/>
+          <w14:ligatures w14:val="standardContextual"/>
+        </w:rPr>
+      </w:pPr>
+      <w:r>
+        <w:rPr>
+          <w:rFonts w:hint="default" w:eastAsia="等线 Light" w:cs="Times New Roman" w:asciiTheme="minorAscii" w:hAnsiTheme="minorAscii"/>
+          <w:color w:val="auto"/>
+          <w:kern w:val="2"/>
+          <w:sz w:val="28"/>
+          <w:szCs w:val="28"/>
+          <w:lang w:val="pl-PL" w:eastAsia="en-US" w:bidi="ar-SA"/>
+          <w14:ligatures w14:val="standardContextual"/>
+        </w:rPr>
+        <w:t>Wciśnięcie spacji</w:t>
+      </w:r>
+    </w:p>
+    <w:p>
+      <w:pPr>
+        <w:numPr>
+          <w:ilvl w:val="0"/>
+          <w:numId w:val="2"/>
+        </w:numPr>
+        <w:ind w:left="425" w:leftChars="0" w:hanging="425" w:firstLineChars="0"/>
+        <w:rPr>
+          <w:rFonts w:hint="default" w:eastAsia="等线 Light" w:cs="Times New Roman" w:asciiTheme="minorAscii" w:hAnsiTheme="minorAscii"/>
+          <w:color w:val="auto"/>
+          <w:kern w:val="2"/>
+          <w:sz w:val="28"/>
+          <w:szCs w:val="28"/>
+          <w:lang w:val="pl-PL" w:eastAsia="en-US" w:bidi="ar-SA"/>
+          <w14:ligatures w14:val="standardContextual"/>
+        </w:rPr>
+      </w:pPr>
+      <w:r>
+        <w:rPr>
+          <w:rFonts w:hint="default" w:eastAsia="等线 Light" w:cs="Times New Roman" w:asciiTheme="minorAscii" w:hAnsiTheme="minorAscii"/>
+          <w:color w:val="auto"/>
+          <w:kern w:val="2"/>
+          <w:sz w:val="28"/>
+          <w:szCs w:val="28"/>
+          <w:lang w:val="pl-PL" w:eastAsia="en-US" w:bidi="ar-SA"/>
+          <w14:ligatures w14:val="standardContextual"/>
+        </w:rPr>
+        <w:t>Wciśnięcie lewego przycisku myszy w okolicy lub bezpośrednio na obiekcie.</w:t>
       </w:r>
     </w:p>
     <w:p>
@@ -2426,6 +2753,98 @@
           <w:numId w:val="0"/>
         </w:numPr>
         <w:ind w:leftChars="0"/>
+        <w:rPr>
+          <w:rFonts w:hint="default" w:eastAsia="等线 Light" w:cs="Times New Roman" w:asciiTheme="minorAscii" w:hAnsiTheme="minorAscii"/>
+          <w:color w:val="auto"/>
+          <w:kern w:val="2"/>
+          <w:sz w:val="28"/>
+          <w:szCs w:val="28"/>
+          <w:lang w:val="pl-PL" w:eastAsia="en-US" w:bidi="ar-SA"/>
+          <w14:ligatures w14:val="standardContextual"/>
+        </w:rPr>
+      </w:pPr>
+      <w:r>
+        <w:rPr>
+          <w:rFonts w:hint="default" w:eastAsia="等线 Light" w:cs="Times New Roman" w:asciiTheme="minorAscii" w:hAnsiTheme="minorAscii"/>
+          <w:color w:val="auto"/>
+          <w:kern w:val="2"/>
+          <w:sz w:val="28"/>
+          <w:szCs w:val="28"/>
+          <w:lang w:val="pl-PL" w:eastAsia="en-US" w:bidi="ar-SA"/>
+          <w14:ligatures w14:val="standardContextual"/>
+        </w:rPr>
+        <w:t>Wyżej wymienionych sposobów nie da się wykorzystywać jednocześnie. Po wykorzystaniu jednej metody, pozostałe zostają zablokowane na krótki czas.</w:t>
+      </w:r>
+    </w:p>
+    <w:p>
+      <w:pPr>
+        <w:numPr>
+          <w:ilvl w:val="0"/>
+          <w:numId w:val="0"/>
+        </w:numPr>
+        <w:ind w:leftChars="0"/>
+        <w:rPr>
+          <w:rFonts w:hint="default" w:eastAsia="等线 Light" w:cs="Times New Roman" w:asciiTheme="minorAscii" w:hAnsiTheme="minorAscii"/>
+          <w:color w:val="auto"/>
+          <w:kern w:val="2"/>
+          <w:sz w:val="28"/>
+          <w:szCs w:val="28"/>
+          <w:lang w:val="pl-PL" w:eastAsia="en-US" w:bidi="ar-SA"/>
+          <w14:ligatures w14:val="standardContextual"/>
+        </w:rPr>
+      </w:pPr>
+    </w:p>
+    <w:p>
+      <w:pPr>
+        <w:numPr>
+          <w:ilvl w:val="0"/>
+          <w:numId w:val="0"/>
+        </w:numPr>
+        <w:ind w:leftChars="0"/>
+        <w:rPr>
+          <w:rFonts w:hint="default" w:eastAsia="等线 Light" w:cs="Times New Roman" w:asciiTheme="minorAscii" w:hAnsiTheme="minorAscii"/>
+          <w:color w:val="auto"/>
+          <w:kern w:val="2"/>
+          <w:sz w:val="28"/>
+          <w:szCs w:val="28"/>
+          <w:lang w:val="pl-PL" w:eastAsia="en-US" w:bidi="ar-SA"/>
+          <w14:ligatures w14:val="standardContextual"/>
+        </w:rPr>
+      </w:pPr>
+      <w:r>
+        <w:rPr>
+          <w:rFonts w:hint="default" w:eastAsia="等线 Light" w:cs="Times New Roman" w:asciiTheme="minorAscii" w:hAnsiTheme="minorAscii"/>
+          <w:color w:val="auto"/>
+          <w:kern w:val="2"/>
+          <w:sz w:val="28"/>
+          <w:szCs w:val="28"/>
+          <w:lang w:val="pl-PL" w:eastAsia="en-US" w:bidi="ar-SA"/>
+          <w14:ligatures w14:val="standardContextual"/>
+        </w:rPr>
+        <w:t>Skill Checki wykorzystują lewy i prawy przycisk mysz w zależności od kierunku w którym przemieszcza się prostokąt.</w:t>
+      </w:r>
+    </w:p>
+    <w:p>
+      <w:pPr>
+        <w:numPr>
+          <w:numId w:val="0"/>
+        </w:numPr>
+        <w:ind w:leftChars="0"/>
+        <w:rPr>
+          <w:rFonts w:hint="default" w:ascii="Calibri" w:hAnsi="Calibri" w:eastAsia="等线 Light" w:cs="Calibri"/>
+          <w:b w:val="0"/>
+          <w:bCs w:val="0"/>
+          <w:color w:val="auto"/>
+          <w:kern w:val="2"/>
+          <w:sz w:val="28"/>
+          <w:szCs w:val="28"/>
+          <w:lang w:val="pl-PL" w:eastAsia="en-US" w:bidi="ar-SA"/>
+          <w14:ligatures w14:val="standardContextual"/>
+        </w:rPr>
+      </w:pPr>
+    </w:p>
+    <w:p>
+      <w:pPr>
         <w:rPr>
           <w:rFonts w:hint="default" w:ascii="Calibri Light" w:hAnsi="Calibri Light" w:eastAsia="等线 Light" w:cs="Times New Roman"/>
           <w:color w:val="2F5496"/>
@@ -2436,6 +2855,68 @@
           <w14:ligatures w14:val="standardContextual"/>
         </w:rPr>
       </w:pPr>
+      <w:r>
+        <w:rPr>
+          <w:rFonts w:hint="default" w:ascii="Calibri Light" w:hAnsi="Calibri Light" w:eastAsia="等线 Light" w:cs="Times New Roman"/>
+          <w:color w:val="2F5496"/>
+          <w:kern w:val="2"/>
+          <w:sz w:val="40"/>
+          <w:szCs w:val="40"/>
+          <w:lang w:val="pl-PL" w:eastAsia="en-US" w:bidi="ar-SA"/>
+          <w14:ligatures w14:val="standardContextual"/>
+        </w:rPr>
+        <w:br w:type="page"/>
+      </w:r>
+      <w:bookmarkStart w:id="0" w:name="_GoBack"/>
+      <w:bookmarkEnd w:id="0"/>
+    </w:p>
+    <w:p>
+      <w:pPr>
+        <w:numPr>
+          <w:ilvl w:val="0"/>
+          <w:numId w:val="1"/>
+        </w:numPr>
+        <w:ind w:left="567" w:leftChars="0" w:hanging="567" w:firstLineChars="0"/>
+        <w:rPr>
+          <w:rFonts w:hint="default" w:ascii="Calibri Light" w:hAnsi="Calibri Light" w:eastAsia="等线 Light" w:cs="Times New Roman"/>
+          <w:color w:val="2F5496"/>
+          <w:kern w:val="2"/>
+          <w:sz w:val="40"/>
+          <w:szCs w:val="40"/>
+          <w:lang w:val="pl-PL" w:eastAsia="en-US" w:bidi="ar-SA"/>
+          <w14:ligatures w14:val="standardContextual"/>
+        </w:rPr>
+      </w:pPr>
+      <w:r>
+        <w:rPr>
+          <w:rFonts w:hint="default" w:ascii="Calibri Light" w:hAnsi="Calibri Light" w:eastAsia="等线 Light" w:cs="Times New Roman"/>
+          <w:color w:val="2F5496"/>
+          <w:kern w:val="2"/>
+          <w:sz w:val="40"/>
+          <w:szCs w:val="40"/>
+          <w:lang w:val="pl-PL" w:eastAsia="en-US" w:bidi="ar-SA"/>
+          <w14:ligatures w14:val="standardContextual"/>
+        </w:rPr>
+        <w:t>Mechaniki gry</w:t>
+      </w:r>
+    </w:p>
+    <w:p>
+      <w:pPr>
+        <w:numPr>
+          <w:ilvl w:val="0"/>
+          <w:numId w:val="0"/>
+        </w:numPr>
+        <w:ind w:leftChars="0"/>
+        <w:rPr>
+          <w:rFonts w:hint="default" w:ascii="Calibri Light" w:hAnsi="Calibri Light" w:eastAsia="等线 Light" w:cs="Times New Roman"/>
+          <w:color w:val="2F5496"/>
+          <w:kern w:val="2"/>
+          <w:sz w:val="40"/>
+          <w:szCs w:val="40"/>
+          <w:lang w:val="pl-PL" w:eastAsia="en-US" w:bidi="ar-SA"/>
+          <w14:ligatures w14:val="standardContextual"/>
+        </w:rPr>
+      </w:pPr>
     </w:p>
     <w:p>
       <w:pPr>
@@ -2512,16 +2993,16 @@
           <w:lang w:val="pl-PL" w:eastAsia="en-US" w:bidi="ar-SA"/>
           <w14:ligatures w14:val="standardContextual"/>
         </w:rPr>
-        <w:t>Jedyną metodą na zdobywanie zasobów po uruchomienu gry po raz pierwszy jest interakcja z głównym obiektem na trzy sposoby.</w:t>
+        <w:t>Jedyną metodą na zdobywanie zasobów po uruchomienu gry po raz pierwszy jest interakcja z głównym obiektem. Po kliknięciu gracz otrzymuje domyślną wartość dla danego obiektu. W przypadku pierwszego zasobu wartość ta wynosi 1. Wartość ta losowo może zostać zwiększona o 3 w trakcie wciskania. Zjawisko to jest tzw. „klikiem krytycznym”, i moment wystąpienia sygnalizowany jest napisem „Critical!” w okolicy kursora oraz dźwiękiem wybuchu.</w:t>
       </w:r>
     </w:p>
     <w:p>
       <w:pPr>
         <w:numPr>
           <w:ilvl w:val="0"/>
-          <w:numId w:val="2"/>
+          <w:numId w:val="0"/>
         </w:numPr>
-        <w:ind w:left="425" w:leftChars="0" w:hanging="425" w:firstLineChars="0"/>
+        <w:ind w:leftChars="0"/>
         <w:rPr>
           <w:rFonts w:hint="default" w:eastAsia="等线 Light" w:cs="Times New Roman" w:asciiTheme="minorAscii" w:hAnsiTheme="minorAscii"/>
           <w:color w:val="auto"/>
@@ -2532,189 +3013,9 @@
           <w14:ligatures w14:val="standardContextual"/>
         </w:rPr>
       </w:pPr>
-      <w:r>
-        <w:rPr>
-          <w:rFonts w:hint="default" w:eastAsia="等线 Light" w:cs="Times New Roman" w:asciiTheme="minorAscii" w:hAnsiTheme="minorAscii"/>
-          <w:color w:val="auto"/>
-          <w:kern w:val="2"/>
-          <w:sz w:val="28"/>
-          <w:szCs w:val="28"/>
-          <w:lang w:val="pl-PL" w:eastAsia="en-US" w:bidi="ar-SA"/>
-          <w14:ligatures w14:val="standardContextual"/>
-        </w:rPr>
-        <w:t>Wciśnięcie klawisza enter</w:t>
-      </w:r>
-    </w:p>
-    <w:p>
-      <w:pPr>
-        <w:numPr>
-          <w:ilvl w:val="0"/>
-          <w:numId w:val="2"/>
-        </w:numPr>
-        <w:ind w:left="425" w:leftChars="0" w:hanging="425" w:firstLineChars="0"/>
-        <w:rPr>
-          <w:rFonts w:hint="default" w:eastAsia="等线 Light" w:cs="Times New Roman" w:asciiTheme="minorAscii" w:hAnsiTheme="minorAscii"/>
-          <w:color w:val="auto"/>
-          <w:kern w:val="2"/>
-          <w:sz w:val="28"/>
-          <w:szCs w:val="28"/>
-          <w:lang w:val="pl-PL" w:eastAsia="en-US" w:bidi="ar-SA"/>
-          <w14:ligatures w14:val="standardContextual"/>
-        </w:rPr>
-      </w:pPr>
-      <w:r>
-        <w:rPr>
-          <w:rFonts w:hint="default" w:eastAsia="等线 Light" w:cs="Times New Roman" w:asciiTheme="minorAscii" w:hAnsiTheme="minorAscii"/>
-          <w:color w:val="auto"/>
-          <w:kern w:val="2"/>
-          <w:sz w:val="28"/>
-          <w:szCs w:val="28"/>
-          <w:lang w:val="pl-PL" w:eastAsia="en-US" w:bidi="ar-SA"/>
-          <w14:ligatures w14:val="standardContextual"/>
-        </w:rPr>
-        <w:t>Wciśnięcie spacji</w:t>
-      </w:r>
-    </w:p>
-    <w:p>
-      <w:pPr>
-        <w:numPr>
-          <w:ilvl w:val="0"/>
-          <w:numId w:val="2"/>
-        </w:numPr>
-        <w:ind w:left="425" w:leftChars="0" w:hanging="425" w:firstLineChars="0"/>
-        <w:rPr>
-          <w:rFonts w:hint="default" w:eastAsia="等线 Light" w:cs="Times New Roman" w:asciiTheme="minorAscii" w:hAnsiTheme="minorAscii"/>
-          <w:color w:val="auto"/>
-          <w:kern w:val="2"/>
-          <w:sz w:val="28"/>
-          <w:szCs w:val="28"/>
-          <w:lang w:val="pl-PL" w:eastAsia="en-US" w:bidi="ar-SA"/>
-          <w14:ligatures w14:val="standardContextual"/>
-        </w:rPr>
-      </w:pPr>
-      <w:r>
-        <w:rPr>
-          <w:rFonts w:hint="default" w:eastAsia="等线 Light" w:cs="Times New Roman" w:asciiTheme="minorAscii" w:hAnsiTheme="minorAscii"/>
-          <w:color w:val="auto"/>
-          <w:kern w:val="2"/>
-          <w:sz w:val="28"/>
-          <w:szCs w:val="28"/>
-          <w:lang w:val="pl-PL" w:eastAsia="en-US" w:bidi="ar-SA"/>
-          <w14:ligatures w14:val="standardContextual"/>
-        </w:rPr>
-        <w:t>Wciśnięcie lewego przycisku myszy w okolicy lub bezpośrednio na obiekcie.</w:t>
-      </w:r>
-    </w:p>
-    <w:p>
-      <w:pPr>
-        <w:numPr>
-          <w:ilvl w:val="0"/>
-          <w:numId w:val="0"/>
-        </w:numPr>
-        <w:ind w:leftChars="0"/>
-        <w:rPr>
-          <w:rFonts w:hint="default" w:eastAsia="等线 Light" w:cs="Times New Roman" w:asciiTheme="minorAscii" w:hAnsiTheme="minorAscii"/>
-          <w:color w:val="auto"/>
-          <w:kern w:val="2"/>
-          <w:sz w:val="28"/>
-          <w:szCs w:val="28"/>
-          <w:lang w:val="pl-PL" w:eastAsia="en-US" w:bidi="ar-SA"/>
-          <w14:ligatures w14:val="standardContextual"/>
-        </w:rPr>
-      </w:pPr>
-      <w:r>
-        <w:rPr>
-          <w:rFonts w:hint="default" w:eastAsia="等线 Light" w:cs="Times New Roman" w:asciiTheme="minorAscii" w:hAnsiTheme="minorAscii"/>
-          <w:color w:val="auto"/>
-          <w:kern w:val="2"/>
-          <w:sz w:val="28"/>
-          <w:szCs w:val="28"/>
-          <w:lang w:val="pl-PL" w:eastAsia="en-US" w:bidi="ar-SA"/>
-          <w14:ligatures w14:val="standardContextual"/>
-        </w:rPr>
-        <w:t>Wyżej wymienionych sposobów nie da się wykorzystywać jednocześnie. Po wykorzystaniu jednej metody, pozostałe zostają zablokowane na krótką chwilę.</w:t>
-      </w:r>
-    </w:p>
-    <w:p>
-      <w:pPr>
-        <w:numPr>
-          <w:ilvl w:val="0"/>
-          <w:numId w:val="0"/>
-        </w:numPr>
-        <w:ind w:leftChars="0"/>
-        <w:rPr>
-          <w:rFonts w:hint="default" w:eastAsia="等线 Light" w:cs="Times New Roman" w:asciiTheme="minorAscii" w:hAnsiTheme="minorAscii"/>
-          <w:color w:val="auto"/>
-          <w:kern w:val="2"/>
-          <w:sz w:val="28"/>
-          <w:szCs w:val="28"/>
-          <w:lang w:val="pl-PL" w:eastAsia="en-US" w:bidi="ar-SA"/>
-          <w14:ligatures w14:val="standardContextual"/>
-        </w:rPr>
-      </w:pPr>
-      <w:r>
-        <w:rPr>
-          <w:rFonts w:hint="default" w:eastAsia="等线 Light" w:cs="Times New Roman" w:asciiTheme="minorAscii" w:hAnsiTheme="minorAscii"/>
-          <w:color w:val="auto"/>
-          <w:kern w:val="2"/>
-          <w:sz w:val="28"/>
-          <w:szCs w:val="28"/>
-          <w:lang w:val="pl-PL" w:eastAsia="en-US" w:bidi="ar-SA"/>
-          <w14:ligatures w14:val="standardContextual"/>
-        </w:rPr>
-        <w:t>Po kliknięciu gracz otrzymuje domyślną wartość dla danego obiektu. W przypadku pierwszego zasobu wartość ta wynosi 1. Wartość ta losowo może zostać zwiększona o 3 w trakcie wciskania. Zjawisko to jest tzw. „klikiem krytycznym”, i moment wystąpienia sygnalizowany jest napisem „Critical!” w okolicy kursora oraz dźwiękiem wybuchu.</w:t>
-      </w:r>
-    </w:p>
-    <w:p>
-      <w:pPr>
-        <w:numPr>
-          <w:ilvl w:val="0"/>
-          <w:numId w:val="0"/>
-        </w:numPr>
-        <w:ind w:leftChars="0"/>
-        <w:rPr>
-          <w:rFonts w:hint="default" w:eastAsia="等线 Light" w:cs="Times New Roman" w:asciiTheme="minorAscii" w:hAnsiTheme="minorAscii"/>
-          <w:color w:val="auto"/>
-          <w:kern w:val="2"/>
-          <w:sz w:val="28"/>
-          <w:szCs w:val="28"/>
-          <w:lang w:val="pl-PL" w:eastAsia="en-US" w:bidi="ar-SA"/>
-          <w14:ligatures w14:val="standardContextual"/>
-        </w:rPr>
-      </w:pPr>
-    </w:p>
-    <w:p>
-      <w:pPr>
-        <w:rPr>
-          <w:rFonts w:hint="default" w:ascii="Calibri Light" w:hAnsi="Calibri Light" w:eastAsia="等线 Light" w:cs="Times New Roman"/>
-          <w:color w:val="2F5496"/>
-          <w:kern w:val="2"/>
-          <w:sz w:val="32"/>
-          <w:szCs w:val="32"/>
-          <w:lang w:val="pl-PL" w:eastAsia="en-US" w:bidi="ar-SA"/>
-          <w14:ligatures w14:val="standardContextual"/>
-        </w:rPr>
-      </w:pPr>
-      <w:r>
-        <w:rPr>
-          <w:rFonts w:hint="default" w:ascii="Calibri Light" w:hAnsi="Calibri Light" w:eastAsia="等线 Light" w:cs="Times New Roman"/>
-          <w:color w:val="2F5496"/>
-          <w:kern w:val="2"/>
-          <w:sz w:val="32"/>
-          <w:szCs w:val="32"/>
-          <w:lang w:val="pl-PL" w:eastAsia="en-US" w:bidi="ar-SA"/>
-          <w14:ligatures w14:val="standardContextual"/>
-        </w:rPr>
-        <w:br w:type="page"/>
-      </w:r>
-    </w:p>
-    <w:p>
-      <w:pPr>
-        <w:numPr>
-          <w:ilvl w:val="0"/>
-          <w:numId w:val="0"/>
-        </w:numPr>
-        <w:ind w:leftChars="0"/>
+    </w:p>
+    <w:p>
+      <w:pPr>
         <w:rPr>
           <w:rFonts w:hint="default" w:ascii="Calibri Light" w:hAnsi="Calibri Light" w:eastAsia="等线 Light" w:cs="Times New Roman"/>
           <w:color w:val="2F5496"/>
@@ -2973,8 +3274,8 @@
         </w:tblCellMar>
       </w:tblPr>
       <w:tblGrid>
-        <w:gridCol w:w="3560"/>
-        <w:gridCol w:w="3560"/>
+        <w:gridCol w:w="2417"/>
+        <w:gridCol w:w="4703"/>
         <w:gridCol w:w="3560"/>
       </w:tblGrid>
       <w:tr>
@@ -2996,7 +3297,7 @@
         </w:tblPrEx>
         <w:tc>
           <w:tcPr>
-            <w:tcW w:w="3560" w:type="dxa"/>
+            <w:tcW w:w="2417" w:type="dxa"/>
           </w:tcPr>
           <w:p>
             <w:pPr>
@@ -3030,7 +3331,7 @@
         </w:tc>
         <w:tc>
           <w:tcPr>
-            <w:tcW w:w="3560" w:type="dxa"/>
+            <w:tcW w:w="4703" w:type="dxa"/>
           </w:tcPr>
           <w:p>
             <w:pPr>
@@ -3116,7 +3417,7 @@
         </w:tblPrEx>
         <w:tc>
           <w:tcPr>
-            <w:tcW w:w="3560" w:type="dxa"/>
+            <w:tcW w:w="2417" w:type="dxa"/>
           </w:tcPr>
           <w:p>
             <w:pPr>
@@ -3150,7 +3451,7 @@
         </w:tc>
         <w:tc>
           <w:tcPr>
-            <w:tcW w:w="3560" w:type="dxa"/>
+            <w:tcW w:w="4703" w:type="dxa"/>
           </w:tcPr>
           <w:p>
             <w:pPr>
@@ -3266,7 +3567,7 @@
         </w:tblPrEx>
         <w:tc>
           <w:tcPr>
-            <w:tcW w:w="3560" w:type="dxa"/>
+            <w:tcW w:w="2417" w:type="dxa"/>
           </w:tcPr>
           <w:p>
             <w:pPr>
@@ -3300,7 +3601,7 @@
         </w:tc>
         <w:tc>
           <w:tcPr>
-            <w:tcW w:w="3560" w:type="dxa"/>
+            <w:tcW w:w="4703" w:type="dxa"/>
           </w:tcPr>
           <w:p>
             <w:pPr>
@@ -3415,7 +3716,7 @@
         </w:tblPrEx>
         <w:tc>
           <w:tcPr>
-            <w:tcW w:w="3560" w:type="dxa"/>
+            <w:tcW w:w="2417" w:type="dxa"/>
           </w:tcPr>
           <w:p>
             <w:pPr>
@@ -3449,7 +3750,7 @@
         </w:tc>
         <w:tc>
           <w:tcPr>
-            <w:tcW w:w="3560" w:type="dxa"/>
+            <w:tcW w:w="4703" w:type="dxa"/>
           </w:tcPr>
           <w:p>
             <w:pPr>
@@ -3574,7 +3875,7 @@
         </w:tblPrEx>
         <w:tc>
           <w:tcPr>
-            <w:tcW w:w="3560" w:type="dxa"/>
+            <w:tcW w:w="2417" w:type="dxa"/>
           </w:tcPr>
           <w:p>
             <w:pPr>
@@ -3608,7 +3909,7 @@
         </w:tc>
         <w:tc>
           <w:tcPr>
-            <w:tcW w:w="3560" w:type="dxa"/>
+            <w:tcW w:w="4703" w:type="dxa"/>
           </w:tcPr>
           <w:p>
             <w:pPr>
@@ -3723,7 +4024,7 @@
         </w:tblPrEx>
         <w:tc>
           <w:tcPr>
-            <w:tcW w:w="3560" w:type="dxa"/>
+            <w:tcW w:w="2417" w:type="dxa"/>
           </w:tcPr>
           <w:p>
             <w:pPr>
@@ -3757,7 +4058,7 @@
         </w:tc>
         <w:tc>
           <w:tcPr>
-            <w:tcW w:w="3560" w:type="dxa"/>
+            <w:tcW w:w="4703" w:type="dxa"/>
           </w:tcPr>
           <w:p>
             <w:pPr>
@@ -3872,7 +4173,7 @@
         </w:tblPrEx>
         <w:tc>
           <w:tcPr>
-            <w:tcW w:w="3560" w:type="dxa"/>
+            <w:tcW w:w="2417" w:type="dxa"/>
           </w:tcPr>
           <w:p>
             <w:pPr>
@@ -3906,7 +4207,7 @@
         </w:tc>
         <w:tc>
           <w:tcPr>
-            <w:tcW w:w="3560" w:type="dxa"/>
+            <w:tcW w:w="4703" w:type="dxa"/>
           </w:tcPr>
           <w:p>
             <w:pPr>
@@ -4015,18 +4316,19 @@
           <w14:ligatures w14:val="standardContextual"/>
         </w:rPr>
       </w:pPr>
-      <w:r>
-        <w:rPr>
-          <w:rFonts w:hint="default" w:ascii="Calibri" w:hAnsi="Calibri" w:eastAsia="等线 Light" w:cs="Calibri"/>
-          <w:color w:val="auto"/>
+    </w:p>
+    <w:p>
+      <w:pPr>
+        <w:rPr>
+          <w:rFonts w:hint="default" w:ascii="Calibri Light" w:hAnsi="Calibri Light" w:eastAsia="等线 Light" w:cs="Times New Roman"/>
+          <w:color w:val="2F5496"/>
           <w:kern w:val="2"/>
-          <w:sz w:val="28"/>
-          <w:szCs w:val="28"/>
+          <w:sz w:val="32"/>
+          <w:szCs w:val="32"/>
           <w:lang w:val="pl-PL" w:eastAsia="en-US" w:bidi="ar-SA"/>
           <w14:ligatures w14:val="standardContextual"/>
         </w:rPr>
-        <w:br w:type="page"/>
-      </w:r>
+      </w:pPr>
       <w:r>
         <w:rPr>
           <w:rFonts w:hint="default" w:ascii="Calibri Light" w:hAnsi="Calibri Light" w:eastAsia="等线 Light" w:cs="Times New Roman"/>
@@ -4315,11 +4617,19 @@
       <w:pPr>
         <w:rPr>
           <w:rFonts w:hint="default" w:ascii="Calibri Light" w:hAnsi="Calibri Light" w:eastAsia="等线 Light" w:cs="Times New Roman"/>
-          <w:color w:val="2F5496"/>
+          <w:color w:val="F4B183" w:themeColor="accent2" w:themeTint="99"/>
           <w:kern w:val="2"/>
-          <w:sz w:val="32"/>
-          <w:szCs w:val="32"/>
+          <w:sz w:val="28"/>
+          <w:szCs w:val="28"/>
           <w:lang w:val="pl-PL" w:eastAsia="en-US" w:bidi="ar-SA"/>
+          <w14:textFill>
+            <w14:solidFill>
+              <w14:schemeClr w14:val="accent2">
+                <w14:lumMod w14:val="60000"/>
+                <w14:lumOff w14:val="40000"/>
+              </w14:schemeClr>
+            </w14:solidFill>
+          </w14:textFill>
           <w14:ligatures w14:val="standardContextual"/>
         </w:rPr>
       </w:pPr>
@@ -5220,21 +5530,338 @@
           </w:p>
         </w:tc>
       </w:tr>
+      <w:tr>
+        <w:tblPrEx>
+          <w:tblBorders>
+            <w:top w:val="single" w:color="auto" w:sz="4" w:space="0"/>
+            <w:left w:val="single" w:color="auto" w:sz="4" w:space="0"/>
+            <w:bottom w:val="single" w:color="auto" w:sz="4" w:space="0"/>
+            <w:right w:val="single" w:color="auto" w:sz="4" w:space="0"/>
+            <w:insideH w:val="single" w:color="auto" w:sz="4" w:space="0"/>
+            <w:insideV w:val="single" w:color="auto" w:sz="4" w:space="0"/>
+          </w:tblBorders>
+          <w:tblCellMar>
+            <w:top w:w="0" w:type="dxa"/>
+            <w:left w:w="108" w:type="dxa"/>
+            <w:bottom w:w="0" w:type="dxa"/>
+            <w:right w:w="108" w:type="dxa"/>
+          </w:tblCellMar>
+        </w:tblPrEx>
+        <w:tc>
+          <w:tcPr>
+            <w:tcW w:w="5341" w:type="dxa"/>
+          </w:tcPr>
+          <w:p>
+            <w:pPr>
+              <w:widowControl w:val="0"/>
+              <w:jc w:val="both"/>
+              <w:rPr>
+                <w:rFonts w:hint="default" w:ascii="Calibri" w:hAnsi="Calibri" w:eastAsia="等线 Light" w:cs="Calibri"/>
+                <w:color w:val="auto"/>
+                <w:kern w:val="2"/>
+                <w:sz w:val="28"/>
+                <w:szCs w:val="28"/>
+                <w:vertAlign w:val="baseline"/>
+                <w:lang w:val="pl-PL" w:eastAsia="en-US" w:bidi="ar-SA"/>
+                <w14:ligatures w14:val="standardContextual"/>
+              </w:rPr>
+            </w:pPr>
+            <w:r>
+              <w:rPr>
+                <w:sz w:val="28"/>
+                <w:szCs w:val="28"/>
+              </w:rPr>
+              <w:t>Mortal Clicker</w:t>
+            </w:r>
+          </w:p>
+        </w:tc>
+        <w:tc>
+          <w:tcPr>
+            <w:tcW w:w="5341" w:type="dxa"/>
+          </w:tcPr>
+          <w:p>
+            <w:pPr>
+              <w:widowControl w:val="0"/>
+              <w:jc w:val="both"/>
+              <w:rPr>
+                <w:rFonts w:hint="default" w:ascii="Calibri" w:hAnsi="Calibri" w:eastAsia="等线 Light" w:cs="Calibri"/>
+                <w:color w:val="auto"/>
+                <w:kern w:val="2"/>
+                <w:sz w:val="28"/>
+                <w:szCs w:val="28"/>
+                <w:vertAlign w:val="baseline"/>
+                <w:lang w:val="pl-PL" w:eastAsia="en-US" w:bidi="ar-SA"/>
+                <w14:ligatures w14:val="standardContextual"/>
+              </w:rPr>
+            </w:pPr>
+            <w:r>
+              <w:rPr>
+                <w:sz w:val="28"/>
+                <w:szCs w:val="28"/>
+              </w:rPr>
+              <w:t xml:space="preserve">Każdy kolejny </w:t>
+            </w:r>
+            <w:r>
+              <w:rPr>
+                <w:rFonts w:hint="default"/>
+                <w:sz w:val="28"/>
+                <w:szCs w:val="28"/>
+                <w:lang w:val="pl-PL"/>
+              </w:rPr>
+              <w:t>S</w:t>
+            </w:r>
+            <w:r>
+              <w:rPr>
+                <w:sz w:val="28"/>
+                <w:szCs w:val="28"/>
+              </w:rPr>
+              <w:t xml:space="preserve">kill </w:t>
+            </w:r>
+            <w:r>
+              <w:rPr>
+                <w:rFonts w:hint="default"/>
+                <w:sz w:val="28"/>
+                <w:szCs w:val="28"/>
+                <w:lang w:val="pl-PL"/>
+              </w:rPr>
+              <w:t>C</w:t>
+            </w:r>
+            <w:r>
+              <w:rPr>
+                <w:sz w:val="28"/>
+                <w:szCs w:val="28"/>
+              </w:rPr>
+              <w:t xml:space="preserve">heck </w:t>
+            </w:r>
+            <w:r>
+              <w:rPr>
+                <w:rFonts w:hint="default"/>
+                <w:sz w:val="28"/>
+                <w:szCs w:val="28"/>
+                <w:lang w:val="pl-PL"/>
+              </w:rPr>
+              <w:t>się kumuluje</w:t>
+            </w:r>
+            <w:r>
+              <w:rPr>
+                <w:sz w:val="28"/>
+                <w:szCs w:val="28"/>
+              </w:rPr>
+              <w:t>. Im większ</w:t>
+            </w:r>
+            <w:r>
+              <w:rPr>
+                <w:rFonts w:hint="default"/>
+                <w:sz w:val="28"/>
+                <w:szCs w:val="28"/>
+                <w:lang w:val="pl-PL"/>
+              </w:rPr>
+              <w:t>a</w:t>
+            </w:r>
+            <w:r>
+              <w:rPr>
+                <w:sz w:val="28"/>
+                <w:szCs w:val="28"/>
+              </w:rPr>
+              <w:t xml:space="preserve"> </w:t>
+            </w:r>
+            <w:r>
+              <w:rPr>
+                <w:rFonts w:hint="default"/>
+                <w:sz w:val="28"/>
+                <w:szCs w:val="28"/>
+                <w:lang w:val="pl-PL"/>
+              </w:rPr>
+              <w:t>kumulacja,</w:t>
+            </w:r>
+            <w:r>
+              <w:rPr>
+                <w:sz w:val="28"/>
+                <w:szCs w:val="28"/>
+              </w:rPr>
+              <w:t xml:space="preserve"> tym więcej punktów za klik</w:t>
+            </w:r>
+            <w:r>
+              <w:rPr>
+                <w:rFonts w:hint="default"/>
+                <w:sz w:val="28"/>
+                <w:szCs w:val="28"/>
+                <w:lang w:val="pl-PL"/>
+              </w:rPr>
+              <w:t>. Resetuje się po nieudanym Skill Checku</w:t>
+            </w:r>
+          </w:p>
+        </w:tc>
+      </w:tr>
+      <w:tr>
+        <w:tblPrEx>
+          <w:tblBorders>
+            <w:top w:val="single" w:color="auto" w:sz="4" w:space="0"/>
+            <w:left w:val="single" w:color="auto" w:sz="4" w:space="0"/>
+            <w:bottom w:val="single" w:color="auto" w:sz="4" w:space="0"/>
+            <w:right w:val="single" w:color="auto" w:sz="4" w:space="0"/>
+            <w:insideH w:val="single" w:color="auto" w:sz="4" w:space="0"/>
+            <w:insideV w:val="single" w:color="auto" w:sz="4" w:space="0"/>
+          </w:tblBorders>
+          <w:tblCellMar>
+            <w:top w:w="0" w:type="dxa"/>
+            <w:left w:w="108" w:type="dxa"/>
+            <w:bottom w:w="0" w:type="dxa"/>
+            <w:right w:w="108" w:type="dxa"/>
+          </w:tblCellMar>
+        </w:tblPrEx>
+        <w:tc>
+          <w:tcPr>
+            <w:tcW w:w="5341" w:type="dxa"/>
+          </w:tcPr>
+          <w:p>
+            <w:pPr>
+              <w:widowControl w:val="0"/>
+              <w:jc w:val="both"/>
+              <w:rPr>
+                <w:rFonts w:hint="default" w:ascii="Calibri" w:hAnsi="Calibri" w:eastAsia="等线 Light" w:cs="Calibri"/>
+                <w:color w:val="auto"/>
+                <w:kern w:val="2"/>
+                <w:sz w:val="28"/>
+                <w:szCs w:val="28"/>
+                <w:vertAlign w:val="baseline"/>
+                <w:lang w:val="pl-PL" w:eastAsia="en-US" w:bidi="ar-SA"/>
+                <w14:ligatures w14:val="standardContextual"/>
+              </w:rPr>
+            </w:pPr>
+            <w:r>
+              <w:rPr>
+                <w:rFonts w:hint="default" w:ascii="Calibri" w:hAnsi="Calibri" w:eastAsia="等线 Light" w:cs="Calibri"/>
+                <w:color w:val="auto"/>
+                <w:kern w:val="2"/>
+                <w:sz w:val="28"/>
+                <w:szCs w:val="28"/>
+                <w:vertAlign w:val="baseline"/>
+                <w:lang w:val="pl-PL" w:eastAsia="en-US" w:bidi="ar-SA"/>
+                <w14:ligatures w14:val="standardContextual"/>
+              </w:rPr>
+              <w:t>Champion of Clicks</w:t>
+            </w:r>
+          </w:p>
+        </w:tc>
+        <w:tc>
+          <w:tcPr>
+            <w:tcW w:w="5341" w:type="dxa"/>
+          </w:tcPr>
+          <w:p>
+            <w:pPr>
+              <w:widowControl w:val="0"/>
+              <w:jc w:val="both"/>
+              <w:rPr>
+                <w:rFonts w:hint="default" w:ascii="Calibri" w:hAnsi="Calibri" w:eastAsia="等线 Light" w:cs="Calibri"/>
+                <w:color w:val="auto"/>
+                <w:kern w:val="2"/>
+                <w:sz w:val="28"/>
+                <w:szCs w:val="28"/>
+                <w:vertAlign w:val="baseline"/>
+                <w:lang w:val="pl-PL" w:eastAsia="en-US" w:bidi="ar-SA"/>
+                <w14:ligatures w14:val="standardContextual"/>
+              </w:rPr>
+            </w:pPr>
+            <w:r>
+              <w:rPr>
+                <w:rFonts w:hint="default" w:ascii="Calibri" w:hAnsi="Calibri" w:eastAsia="等线 Light" w:cs="Calibri"/>
+                <w:color w:val="auto"/>
+                <w:kern w:val="2"/>
+                <w:sz w:val="28"/>
+                <w:szCs w:val="28"/>
+                <w:vertAlign w:val="baseline"/>
+                <w:lang w:val="pl-PL" w:eastAsia="en-US" w:bidi="ar-SA"/>
+                <w14:ligatures w14:val="standardContextual"/>
+              </w:rPr>
+              <w:t>Po trzech udanych Skill Checkach pod rząd, zwiększa chwilowo szansę na krytyczne kliknięcie do 100%.</w:t>
+            </w:r>
+          </w:p>
+        </w:tc>
+      </w:tr>
     </w:tbl>
     <w:p>
       <w:pPr>
         <w:rPr>
+          <w:rFonts w:hint="default" w:ascii="Calibri Light" w:hAnsi="Calibri Light" w:eastAsia="等线 Light" w:cs="Times New Roman"/>
+          <w:color w:val="F4B183" w:themeColor="accent2" w:themeTint="99"/>
+          <w:kern w:val="2"/>
           <w:sz w:val="28"/>
           <w:szCs w:val="28"/>
-        </w:rPr>
-      </w:pPr>
-      <w:r>
-        <w:rPr>
+          <w:lang w:val="pl-PL" w:eastAsia="en-US" w:bidi="ar-SA"/>
+          <w14:textFill>
+            <w14:solidFill>
+              <w14:schemeClr w14:val="accent2">
+                <w14:lumMod w14:val="60000"/>
+                <w14:lumOff w14:val="40000"/>
+              </w14:schemeClr>
+            </w14:solidFill>
+          </w14:textFill>
+          <w14:ligatures w14:val="standardContextual"/>
+        </w:rPr>
+      </w:pPr>
+    </w:p>
+    <w:p>
+      <w:pPr>
+        <w:rPr>
+          <w:rFonts w:hint="default" w:ascii="Calibri Light" w:hAnsi="Calibri Light" w:eastAsia="等线 Light" w:cs="Times New Roman"/>
+          <w:color w:val="F4B183" w:themeColor="accent2" w:themeTint="99"/>
+          <w:kern w:val="2"/>
           <w:sz w:val="28"/>
           <w:szCs w:val="28"/>
-        </w:rPr>
-        <w:br w:type="page"/>
+          <w:lang w:val="pl-PL" w:eastAsia="en-US" w:bidi="ar-SA"/>
+          <w14:textFill>
+            <w14:solidFill>
+              <w14:schemeClr w14:val="accent2">
+                <w14:lumMod w14:val="60000"/>
+                <w14:lumOff w14:val="40000"/>
+              </w14:schemeClr>
+            </w14:solidFill>
+          </w14:textFill>
+          <w14:ligatures w14:val="standardContextual"/>
+        </w:rPr>
+      </w:pPr>
+      <w:r>
+        <w:rPr>
+          <w:rFonts w:hint="default" w:ascii="Calibri Light" w:hAnsi="Calibri Light" w:eastAsia="等线 Light" w:cs="Times New Roman"/>
+          <w:color w:val="F4B183" w:themeColor="accent2" w:themeTint="99"/>
+          <w:kern w:val="2"/>
+          <w:sz w:val="28"/>
+          <w:szCs w:val="28"/>
+          <w:lang w:val="pl-PL" w:eastAsia="en-US" w:bidi="ar-SA"/>
+          <w14:textFill>
+            <w14:solidFill>
+              <w14:schemeClr w14:val="accent2">
+                <w14:lumMod w14:val="60000"/>
+                <w14:lumOff w14:val="40000"/>
+              </w14:schemeClr>
+            </w14:solidFill>
+          </w14:textFill>
+          <w14:ligatures w14:val="standardContextual"/>
+        </w:rPr>
+        <w:t>Automatron</w:t>
       </w:r>
+    </w:p>
+    <w:p>
+      <w:pPr>
+        <w:rPr>
+          <w:rFonts w:hint="default" w:ascii="Calibri Light" w:hAnsi="Calibri Light" w:eastAsia="等线 Light" w:cs="Times New Roman"/>
+          <w:color w:val="F4B183" w:themeColor="accent2" w:themeTint="99"/>
+          <w:kern w:val="2"/>
+          <w:sz w:val="28"/>
+          <w:szCs w:val="28"/>
+          <w:lang w:val="pl-PL" w:eastAsia="en-US" w:bidi="ar-SA"/>
+          <w14:textFill>
+            <w14:solidFill>
+              <w14:schemeClr w14:val="accent2">
+                <w14:lumMod w14:val="60000"/>
+                <w14:lumOff w14:val="40000"/>
+              </w14:schemeClr>
+            </w14:solidFill>
+          </w14:textFill>
+          <w14:ligatures w14:val="standardContextual"/>
+        </w:rPr>
+      </w:pPr>
     </w:p>
     <w:tbl>
       <w:tblPr>
@@ -5299,10 +5926,16 @@
             </w:pPr>
             <w:r>
               <w:rPr>
-                <w:sz w:val="28"/>
-                <w:szCs w:val="28"/>
-              </w:rPr>
-              <w:t>Mortal Clicker</w:t>
+                <w:rFonts w:hint="default" w:ascii="Calibri" w:hAnsi="Calibri" w:eastAsia="等线 Light" w:cs="Calibri"/>
+                <w:color w:val="auto"/>
+                <w:kern w:val="2"/>
+                <w:sz w:val="28"/>
+                <w:szCs w:val="28"/>
+                <w:vertAlign w:val="baseline"/>
+                <w:lang w:val="pl-PL" w:eastAsia="en-US" w:bidi="ar-SA"/>
+                <w14:ligatures w14:val="standardContextual"/>
+              </w:rPr>
+              <w:t>Nazwa umiejętności</w:t>
             </w:r>
           </w:p>
         </w:tc>
@@ -5327,99 +5960,16 @@
             </w:pPr>
             <w:r>
               <w:rPr>
-                <w:sz w:val="28"/>
-                <w:szCs w:val="28"/>
-              </w:rPr>
-              <w:t xml:space="preserve">Każdy kolejny </w:t>
-            </w:r>
-            <w:r>
-              <w:rPr>
-                <w:rFonts w:hint="default"/>
-                <w:sz w:val="28"/>
-                <w:szCs w:val="28"/>
-                <w:lang w:val="pl-PL"/>
-              </w:rPr>
-              <w:t>S</w:t>
-            </w:r>
-            <w:r>
-              <w:rPr>
-                <w:sz w:val="28"/>
-                <w:szCs w:val="28"/>
-              </w:rPr>
-              <w:t xml:space="preserve">kill </w:t>
-            </w:r>
-            <w:r>
-              <w:rPr>
-                <w:rFonts w:hint="default"/>
-                <w:sz w:val="28"/>
-                <w:szCs w:val="28"/>
-                <w:lang w:val="pl-PL"/>
-              </w:rPr>
-              <w:t>C</w:t>
-            </w:r>
-            <w:r>
-              <w:rPr>
-                <w:sz w:val="28"/>
-                <w:szCs w:val="28"/>
-              </w:rPr>
-              <w:t xml:space="preserve">heck </w:t>
-            </w:r>
-            <w:r>
-              <w:rPr>
-                <w:rFonts w:hint="default"/>
-                <w:sz w:val="28"/>
-                <w:szCs w:val="28"/>
-                <w:lang w:val="pl-PL"/>
-              </w:rPr>
-              <w:t>się kumuluje</w:t>
-            </w:r>
-            <w:r>
-              <w:rPr>
-                <w:sz w:val="28"/>
-                <w:szCs w:val="28"/>
-              </w:rPr>
-              <w:t>. Im większ</w:t>
-            </w:r>
-            <w:r>
-              <w:rPr>
-                <w:rFonts w:hint="default"/>
-                <w:sz w:val="28"/>
-                <w:szCs w:val="28"/>
-                <w:lang w:val="pl-PL"/>
-              </w:rPr>
-              <w:t>a</w:t>
-            </w:r>
-            <w:r>
-              <w:rPr>
-                <w:sz w:val="28"/>
-                <w:szCs w:val="28"/>
-              </w:rPr>
-              <w:t xml:space="preserve"> </w:t>
-            </w:r>
-            <w:r>
-              <w:rPr>
-                <w:rFonts w:hint="default"/>
-                <w:sz w:val="28"/>
-                <w:szCs w:val="28"/>
-                <w:lang w:val="pl-PL"/>
-              </w:rPr>
-              <w:t>kumulacja,</w:t>
-            </w:r>
-            <w:r>
-              <w:rPr>
-                <w:sz w:val="28"/>
-                <w:szCs w:val="28"/>
-              </w:rPr>
-              <w:t xml:space="preserve"> tym więcej punktów za klik</w:t>
-            </w:r>
-            <w:r>
-              <w:rPr>
-                <w:rFonts w:hint="default"/>
-                <w:sz w:val="28"/>
-                <w:szCs w:val="28"/>
-                <w:lang w:val="pl-PL"/>
-              </w:rPr>
-              <w:t>. Resetuje się po nieudanym Skill Checku</w:t>
+                <w:rFonts w:hint="default" w:ascii="Calibri" w:hAnsi="Calibri" w:eastAsia="等线 Light" w:cs="Calibri"/>
+                <w:color w:val="auto"/>
+                <w:kern w:val="2"/>
+                <w:sz w:val="28"/>
+                <w:szCs w:val="28"/>
+                <w:vertAlign w:val="baseline"/>
+                <w:lang w:val="pl-PL" w:eastAsia="en-US" w:bidi="ar-SA"/>
+                <w14:ligatures w14:val="standardContextual"/>
+              </w:rPr>
+              <w:t>Opis efektu</w:t>
             </w:r>
           </w:p>
         </w:tc>
@@ -5444,34 +5994,36 @@
         <w:tc>
           <w:tcPr>
             <w:tcW w:w="5341" w:type="dxa"/>
-          </w:tcPr>
-          <w:p>
-            <w:pPr>
-              <w:widowControl w:val="0"/>
-              <w:jc w:val="both"/>
-              <w:rPr>
-                <w:rFonts w:hint="default" w:ascii="Calibri" w:hAnsi="Calibri" w:eastAsia="等线 Light" w:cs="Calibri"/>
-                <w:color w:val="auto"/>
-                <w:kern w:val="2"/>
-                <w:sz w:val="28"/>
-                <w:szCs w:val="28"/>
-                <w:vertAlign w:val="baseline"/>
-                <w:lang w:val="pl-PL" w:eastAsia="en-US" w:bidi="ar-SA"/>
-                <w14:ligatures w14:val="standardContextual"/>
-              </w:rPr>
-            </w:pPr>
-            <w:r>
-              <w:rPr>
-                <w:rFonts w:hint="default" w:ascii="Calibri" w:hAnsi="Calibri" w:eastAsia="等线 Light" w:cs="Calibri"/>
-                <w:color w:val="auto"/>
-                <w:kern w:val="2"/>
-                <w:sz w:val="28"/>
-                <w:szCs w:val="28"/>
-                <w:vertAlign w:val="baseline"/>
-                <w:lang w:val="pl-PL" w:eastAsia="en-US" w:bidi="ar-SA"/>
-                <w14:ligatures w14:val="standardContextual"/>
-              </w:rPr>
-              <w:t>Champion of Clicks</w:t>
+            <w:shd w:val="clear" w:color="auto" w:fill="auto"/>
+            <w:vAlign w:val="top"/>
+          </w:tcPr>
+          <w:p>
+            <w:pPr>
+              <w:widowControl w:val="0"/>
+              <w:jc w:val="both"/>
+              <w:rPr>
+                <w:rFonts w:hint="default" w:ascii="Calibri" w:hAnsi="Calibri" w:eastAsia="等线 Light" w:cs="Calibri"/>
+                <w:color w:val="auto"/>
+                <w:kern w:val="2"/>
+                <w:sz w:val="28"/>
+                <w:szCs w:val="28"/>
+                <w:vertAlign w:val="baseline"/>
+                <w:lang w:val="pl-PL" w:eastAsia="en-US" w:bidi="ar-SA"/>
+                <w14:ligatures w14:val="standardContextual"/>
+              </w:rPr>
+            </w:pPr>
+            <w:r>
+              <w:rPr>
+                <w:rFonts w:hint="default" w:ascii="Calibri" w:hAnsi="Calibri" w:eastAsia="等线 Light" w:cs="Calibri"/>
+                <w:color w:val="auto"/>
+                <w:kern w:val="2"/>
+                <w:sz w:val="28"/>
+                <w:szCs w:val="28"/>
+                <w:vertAlign w:val="baseline"/>
+                <w:lang w:val="pl-PL" w:eastAsia="en-US" w:bidi="ar-SA"/>
+                <w14:ligatures w14:val="standardContextual"/>
+              </w:rPr>
+              <w:t>Entrepreneur</w:t>
             </w:r>
           </w:p>
         </w:tc>
@@ -5505,223 +6057,7 @@
                 <w:lang w:val="pl-PL" w:eastAsia="en-US" w:bidi="ar-SA"/>
                 <w14:ligatures w14:val="standardContextual"/>
               </w:rPr>
-              <w:t>Po trzech udanych Skill Checkach pod rząd, zwiększa chwilowo szansę na krytyczne kliknięcie do 100%.</w:t>
-            </w:r>
-          </w:p>
-        </w:tc>
-      </w:tr>
-    </w:tbl>
-    <w:p>
-      <w:pPr>
-        <w:rPr>
-          <w:rFonts w:hint="default" w:ascii="Calibri Light" w:hAnsi="Calibri Light" w:eastAsia="等线 Light" w:cs="Times New Roman"/>
-          <w:color w:val="F4B183" w:themeColor="accent2" w:themeTint="99"/>
-          <w:kern w:val="2"/>
-          <w:sz w:val="28"/>
-          <w:szCs w:val="28"/>
-          <w:lang w:val="pl-PL" w:eastAsia="en-US" w:bidi="ar-SA"/>
-          <w14:textFill>
-            <w14:solidFill>
-              <w14:schemeClr w14:val="accent2">
-                <w14:lumMod w14:val="60000"/>
-                <w14:lumOff w14:val="40000"/>
-              </w14:schemeClr>
-            </w14:solidFill>
-          </w14:textFill>
-          <w14:ligatures w14:val="standardContextual"/>
-        </w:rPr>
-      </w:pPr>
-    </w:p>
-    <w:p>
-      <w:pPr>
-        <w:rPr>
-          <w:rFonts w:hint="default" w:ascii="Calibri Light" w:hAnsi="Calibri Light" w:eastAsia="等线 Light" w:cs="Times New Roman"/>
-          <w:color w:val="F4B183" w:themeColor="accent2" w:themeTint="99"/>
-          <w:kern w:val="2"/>
-          <w:sz w:val="28"/>
-          <w:szCs w:val="28"/>
-          <w:lang w:val="pl-PL" w:eastAsia="en-US" w:bidi="ar-SA"/>
-          <w14:textFill>
-            <w14:solidFill>
-              <w14:schemeClr w14:val="accent2">
-                <w14:lumMod w14:val="60000"/>
-                <w14:lumOff w14:val="40000"/>
-              </w14:schemeClr>
-            </w14:solidFill>
-          </w14:textFill>
-          <w14:ligatures w14:val="standardContextual"/>
-        </w:rPr>
-      </w:pPr>
-    </w:p>
-    <w:p>
-      <w:pPr>
-        <w:rPr>
-          <w:rFonts w:hint="default" w:ascii="Calibri Light" w:hAnsi="Calibri Light" w:eastAsia="等线 Light" w:cs="Times New Roman"/>
-          <w:color w:val="F4B183" w:themeColor="accent2" w:themeTint="99"/>
-          <w:kern w:val="2"/>
-          <w:sz w:val="28"/>
-          <w:szCs w:val="28"/>
-          <w:lang w:val="pl-PL" w:eastAsia="en-US" w:bidi="ar-SA"/>
-          <w14:textFill>
-            <w14:solidFill>
-              <w14:schemeClr w14:val="accent2">
-                <w14:lumMod w14:val="60000"/>
-                <w14:lumOff w14:val="40000"/>
-              </w14:schemeClr>
-            </w14:solidFill>
-          </w14:textFill>
-          <w14:ligatures w14:val="standardContextual"/>
-        </w:rPr>
-      </w:pPr>
-      <w:r>
-        <w:rPr>
-          <w:rFonts w:hint="default" w:ascii="Calibri Light" w:hAnsi="Calibri Light" w:eastAsia="等线 Light" w:cs="Times New Roman"/>
-          <w:color w:val="F4B183" w:themeColor="accent2" w:themeTint="99"/>
-          <w:kern w:val="2"/>
-          <w:sz w:val="28"/>
-          <w:szCs w:val="28"/>
-          <w:lang w:val="pl-PL" w:eastAsia="en-US" w:bidi="ar-SA"/>
-          <w14:textFill>
-            <w14:solidFill>
-              <w14:schemeClr w14:val="accent2">
-                <w14:lumMod w14:val="60000"/>
-                <w14:lumOff w14:val="40000"/>
-              </w14:schemeClr>
-            </w14:solidFill>
-          </w14:textFill>
-          <w14:ligatures w14:val="standardContextual"/>
-        </w:rPr>
-        <w:t>Automatron</w:t>
-      </w:r>
-    </w:p>
-    <w:p>
-      <w:pPr>
-        <w:rPr>
-          <w:rFonts w:hint="default" w:ascii="Calibri Light" w:hAnsi="Calibri Light" w:eastAsia="等线 Light" w:cs="Times New Roman"/>
-          <w:color w:val="F4B183" w:themeColor="accent2" w:themeTint="99"/>
-          <w:kern w:val="2"/>
-          <w:sz w:val="28"/>
-          <w:szCs w:val="28"/>
-          <w:lang w:val="pl-PL" w:eastAsia="en-US" w:bidi="ar-SA"/>
-          <w14:textFill>
-            <w14:solidFill>
-              <w14:schemeClr w14:val="accent2">
-                <w14:lumMod w14:val="60000"/>
-                <w14:lumOff w14:val="40000"/>
-              </w14:schemeClr>
-            </w14:solidFill>
-          </w14:textFill>
-          <w14:ligatures w14:val="standardContextual"/>
-        </w:rPr>
-      </w:pPr>
-    </w:p>
-    <w:tbl>
-      <w:tblPr>
-        <w:tblStyle w:val="7"/>
-        <w:tblW w:w="0" w:type="auto"/>
-        <w:tblInd w:w="0" w:type="dxa"/>
-        <w:tblBorders>
-          <w:top w:val="single" w:color="auto" w:sz="4" w:space="0"/>
-          <w:left w:val="single" w:color="auto" w:sz="4" w:space="0"/>
-          <w:bottom w:val="single" w:color="auto" w:sz="4" w:space="0"/>
-          <w:right w:val="single" w:color="auto" w:sz="4" w:space="0"/>
-          <w:insideH w:val="single" w:color="auto" w:sz="4" w:space="0"/>
-          <w:insideV w:val="single" w:color="auto" w:sz="4" w:space="0"/>
-        </w:tblBorders>
-        <w:tblLayout w:type="autofit"/>
-        <w:tblCellMar>
-          <w:top w:w="0" w:type="dxa"/>
-          <w:left w:w="108" w:type="dxa"/>
-          <w:bottom w:w="0" w:type="dxa"/>
-          <w:right w:w="108" w:type="dxa"/>
-        </w:tblCellMar>
-      </w:tblPr>
-      <w:tblGrid>
-        <w:gridCol w:w="5341"/>
-        <w:gridCol w:w="5341"/>
-      </w:tblGrid>
-      <w:tr>
-        <w:tblPrEx>
-          <w:tblBorders>
-            <w:top w:val="single" w:color="auto" w:sz="4" w:space="0"/>
-            <w:left w:val="single" w:color="auto" w:sz="4" w:space="0"/>
-            <w:bottom w:val="single" w:color="auto" w:sz="4" w:space="0"/>
-            <w:right w:val="single" w:color="auto" w:sz="4" w:space="0"/>
-            <w:insideH w:val="single" w:color="auto" w:sz="4" w:space="0"/>
-            <w:insideV w:val="single" w:color="auto" w:sz="4" w:space="0"/>
-          </w:tblBorders>
-          <w:tblCellMar>
-            <w:top w:w="0" w:type="dxa"/>
-            <w:left w:w="108" w:type="dxa"/>
-            <w:bottom w:w="0" w:type="dxa"/>
-            <w:right w:w="108" w:type="dxa"/>
-          </w:tblCellMar>
-        </w:tblPrEx>
-        <w:tc>
-          <w:tcPr>
-            <w:tcW w:w="5341" w:type="dxa"/>
-          </w:tcPr>
-          <w:p>
-            <w:pPr>
-              <w:widowControl w:val="0"/>
-              <w:jc w:val="both"/>
-              <w:rPr>
-                <w:rFonts w:hint="default" w:ascii="Calibri" w:hAnsi="Calibri" w:eastAsia="等线 Light" w:cs="Calibri"/>
-                <w:color w:val="auto"/>
-                <w:kern w:val="2"/>
-                <w:sz w:val="28"/>
-                <w:szCs w:val="28"/>
-                <w:vertAlign w:val="baseline"/>
-                <w:lang w:val="pl-PL" w:eastAsia="en-US" w:bidi="ar-SA"/>
-                <w14:ligatures w14:val="standardContextual"/>
-              </w:rPr>
-            </w:pPr>
-            <w:r>
-              <w:rPr>
-                <w:rFonts w:hint="default" w:ascii="Calibri" w:hAnsi="Calibri" w:eastAsia="等线 Light" w:cs="Calibri"/>
-                <w:color w:val="auto"/>
-                <w:kern w:val="2"/>
-                <w:sz w:val="28"/>
-                <w:szCs w:val="28"/>
-                <w:vertAlign w:val="baseline"/>
-                <w:lang w:val="pl-PL" w:eastAsia="en-US" w:bidi="ar-SA"/>
-                <w14:ligatures w14:val="standardContextual"/>
-              </w:rPr>
-              <w:t>Nazwa umiejętności</w:t>
-            </w:r>
-          </w:p>
-        </w:tc>
-        <w:tc>
-          <w:tcPr>
-            <w:tcW w:w="5341" w:type="dxa"/>
-          </w:tcPr>
-          <w:p>
-            <w:pPr>
-              <w:widowControl w:val="0"/>
-              <w:jc w:val="both"/>
-              <w:rPr>
-                <w:rFonts w:hint="default" w:ascii="Calibri" w:hAnsi="Calibri" w:eastAsia="等线 Light" w:cs="Calibri"/>
-                <w:color w:val="auto"/>
-                <w:kern w:val="2"/>
-                <w:sz w:val="28"/>
-                <w:szCs w:val="28"/>
-                <w:vertAlign w:val="baseline"/>
-                <w:lang w:val="pl-PL" w:eastAsia="en-US" w:bidi="ar-SA"/>
-                <w14:ligatures w14:val="standardContextual"/>
-              </w:rPr>
-            </w:pPr>
-            <w:r>
-              <w:rPr>
-                <w:rFonts w:hint="default" w:ascii="Calibri" w:hAnsi="Calibri" w:eastAsia="等线 Light" w:cs="Calibri"/>
-                <w:color w:val="auto"/>
-                <w:kern w:val="2"/>
-                <w:sz w:val="28"/>
-                <w:szCs w:val="28"/>
-                <w:vertAlign w:val="baseline"/>
-                <w:lang w:val="pl-PL" w:eastAsia="en-US" w:bidi="ar-SA"/>
-                <w14:ligatures w14:val="standardContextual"/>
-              </w:rPr>
-              <w:t>Opis efektu</w:t>
+              <w:t>Zwiększa ilość zdobywanych zasobów przez fabryki w zależności od ilości zakupionych fabryk. (Im więcej fabryk tym większy zysk zasobów)</w:t>
             </w:r>
           </w:p>
         </w:tc>
@@ -5775,7 +6111,7 @@
                 <w:lang w:val="pl-PL" w:eastAsia="en-US" w:bidi="ar-SA"/>
                 <w14:ligatures w14:val="standardContextual"/>
               </w:rPr>
-              <w:t>Entrepreneur</w:t>
+              <w:t>Push to the limit</w:t>
             </w:r>
           </w:p>
         </w:tc>
@@ -5809,7 +6145,7 @@
                 <w:lang w:val="pl-PL" w:eastAsia="en-US" w:bidi="ar-SA"/>
                 <w14:ligatures w14:val="standardContextual"/>
               </w:rPr>
-              <w:t>Zwiększa ilość zdobywanych zasobów przez fabryki w zależności od ilości zakupionych fabryk. (Im więcej fabryk tym większy zysk zasobów)</w:t>
+              <w:t>Dodatkowo zwiększa limit zasobów.</w:t>
             </w:r>
           </w:p>
         </w:tc>
@@ -5863,7 +6199,7 @@
                 <w:lang w:val="pl-PL" w:eastAsia="en-US" w:bidi="ar-SA"/>
                 <w14:ligatures w14:val="standardContextual"/>
               </w:rPr>
-              <w:t>Push to the limit</w:t>
+              <w:t>Reaction Test</w:t>
             </w:r>
           </w:p>
         </w:tc>
@@ -5897,7 +6233,7 @@
                 <w:lang w:val="pl-PL" w:eastAsia="en-US" w:bidi="ar-SA"/>
                 <w14:ligatures w14:val="standardContextual"/>
               </w:rPr>
-              <w:t>Dodatkowo zwiększa limit zasobów.</w:t>
+              <w:t>Skill Checki mogą pojawić się losowo w czasie, zamiast przy kliknięciach.</w:t>
             </w:r>
           </w:p>
         </w:tc>
@@ -5951,7 +6287,7 @@
                 <w:lang w:val="pl-PL" w:eastAsia="en-US" w:bidi="ar-SA"/>
                 <w14:ligatures w14:val="standardContextual"/>
               </w:rPr>
-              <w:t>Reaction Test</w:t>
+              <w:t>Unskilled Predator</w:t>
             </w:r>
           </w:p>
         </w:tc>
@@ -5985,7 +6321,7 @@
                 <w:lang w:val="pl-PL" w:eastAsia="en-US" w:bidi="ar-SA"/>
                 <w14:ligatures w14:val="standardContextual"/>
               </w:rPr>
-              <w:t>Skill Checki mogą pojawić się losowo w czasie, zamiast przy kliknięciach.</w:t>
+              <w:t>Nieudany Skill Check zwiększa zdobywanie zasobów z fabryk.</w:t>
             </w:r>
           </w:p>
         </w:tc>
@@ -6039,7 +6375,7 @@
                 <w:lang w:val="pl-PL" w:eastAsia="en-US" w:bidi="ar-SA"/>
                 <w14:ligatures w14:val="standardContextual"/>
               </w:rPr>
-              <w:t>Unskilled Predator</w:t>
+              <w:t>One for Everyone</w:t>
             </w:r>
           </w:p>
         </w:tc>
@@ -6073,7 +6409,7 @@
                 <w:lang w:val="pl-PL" w:eastAsia="en-US" w:bidi="ar-SA"/>
                 <w14:ligatures w14:val="standardContextual"/>
               </w:rPr>
-              <w:t>Nieudany Skill Check zwiększa zdobywanie zasobów z fabryk.</w:t>
+              <w:t>Znacząco zwiększa zdobywanie zasobów wszystkich fabryk.</w:t>
             </w:r>
           </w:p>
         </w:tc>
@@ -6127,7 +6463,7 @@
                 <w:lang w:val="pl-PL" w:eastAsia="en-US" w:bidi="ar-SA"/>
                 <w14:ligatures w14:val="standardContextual"/>
               </w:rPr>
-              <w:t>One for Everyone</w:t>
+              <w:t>What Eyes Don’t See</w:t>
             </w:r>
           </w:p>
         </w:tc>
@@ -6161,7 +6497,7 @@
                 <w:lang w:val="pl-PL" w:eastAsia="en-US" w:bidi="ar-SA"/>
                 <w14:ligatures w14:val="standardContextual"/>
               </w:rPr>
-              <w:t>Znacząco zwiększa zdobywanie zasobów wszystkich fabryk.</w:t>
+              <w:t>Fabryki z wszystkich lokalizacji oprócz obecnej mają zwiększone zdobywanie zasobów.</w:t>
             </w:r>
           </w:p>
         </w:tc>
@@ -6215,7 +6551,7 @@
                 <w:lang w:val="pl-PL" w:eastAsia="en-US" w:bidi="ar-SA"/>
                 <w14:ligatures w14:val="standardContextual"/>
               </w:rPr>
-              <w:t>What Eyes Don’t See</w:t>
+              <w:t>Passive Agressive</w:t>
             </w:r>
           </w:p>
         </w:tc>
@@ -6249,7 +6585,7 @@
                 <w:lang w:val="pl-PL" w:eastAsia="en-US" w:bidi="ar-SA"/>
                 <w14:ligatures w14:val="standardContextual"/>
               </w:rPr>
-              <w:t>Fabryki z wszystkich lokalizacji oprócz obecnej mają zwiększone zdobywanie zasobów.</w:t>
+              <w:t>Nakłada efekt zwiększonego z czasem wydobywania dla obecnej fabryki, gdy gracz nie klika.</w:t>
             </w:r>
           </w:p>
         </w:tc>
@@ -6303,7 +6639,7 @@
                 <w:lang w:val="pl-PL" w:eastAsia="en-US" w:bidi="ar-SA"/>
                 <w14:ligatures w14:val="standardContextual"/>
               </w:rPr>
-              <w:t>Passive Agressive</w:t>
+              <w:t>Multitasking</w:t>
             </w:r>
           </w:p>
         </w:tc>
@@ -6337,7 +6673,7 @@
                 <w:lang w:val="pl-PL" w:eastAsia="en-US" w:bidi="ar-SA"/>
                 <w14:ligatures w14:val="standardContextual"/>
               </w:rPr>
-              <w:t>Nakłada efekt zwiększonego z czasem wydobywania dla obecnej fabryki, gdy gracz nie klika.</w:t>
+              <w:t>(Odnosnie Passive Agressive) Gracz może klikać, ale efekt wydobywania zwiększa się wolniej.</w:t>
             </w:r>
           </w:p>
         </w:tc>
@@ -6362,36 +6698,34 @@
         <w:tc>
           <w:tcPr>
             <w:tcW w:w="5341" w:type="dxa"/>
-            <w:shd w:val="clear" w:color="auto" w:fill="auto"/>
-            <w:vAlign w:val="top"/>
-          </w:tcPr>
-          <w:p>
-            <w:pPr>
-              <w:widowControl w:val="0"/>
-              <w:jc w:val="both"/>
-              <w:rPr>
-                <w:rFonts w:hint="default" w:ascii="Calibri" w:hAnsi="Calibri" w:eastAsia="等线 Light" w:cs="Calibri"/>
-                <w:color w:val="auto"/>
-                <w:kern w:val="2"/>
-                <w:sz w:val="28"/>
-                <w:szCs w:val="28"/>
-                <w:vertAlign w:val="baseline"/>
-                <w:lang w:val="pl-PL" w:eastAsia="en-US" w:bidi="ar-SA"/>
-                <w14:ligatures w14:val="standardContextual"/>
-              </w:rPr>
-            </w:pPr>
-            <w:r>
-              <w:rPr>
-                <w:rFonts w:hint="default" w:ascii="Calibri" w:hAnsi="Calibri" w:eastAsia="等线 Light" w:cs="Calibri"/>
-                <w:color w:val="auto"/>
-                <w:kern w:val="2"/>
-                <w:sz w:val="28"/>
-                <w:szCs w:val="28"/>
-                <w:vertAlign w:val="baseline"/>
-                <w:lang w:val="pl-PL" w:eastAsia="en-US" w:bidi="ar-SA"/>
-                <w14:ligatures w14:val="standardContextual"/>
-              </w:rPr>
-              <w:t>Multitasking</w:t>
+          </w:tcPr>
+          <w:p>
+            <w:pPr>
+              <w:widowControl w:val="0"/>
+              <w:jc w:val="both"/>
+              <w:rPr>
+                <w:rFonts w:hint="default" w:ascii="Calibri" w:hAnsi="Calibri" w:eastAsia="等线 Light" w:cs="Calibri"/>
+                <w:color w:val="auto"/>
+                <w:kern w:val="2"/>
+                <w:sz w:val="28"/>
+                <w:szCs w:val="28"/>
+                <w:vertAlign w:val="baseline"/>
+                <w:lang w:val="pl-PL" w:eastAsia="en-US" w:bidi="ar-SA"/>
+                <w14:ligatures w14:val="standardContextual"/>
+              </w:rPr>
+            </w:pPr>
+            <w:r>
+              <w:rPr>
+                <w:rFonts w:hint="default" w:ascii="Calibri" w:hAnsi="Calibri" w:eastAsia="等线 Light" w:cs="Calibri"/>
+                <w:color w:val="auto"/>
+                <w:kern w:val="2"/>
+                <w:sz w:val="28"/>
+                <w:szCs w:val="28"/>
+                <w:vertAlign w:val="baseline"/>
+                <w:lang w:val="pl-PL" w:eastAsia="en-US" w:bidi="ar-SA"/>
+                <w14:ligatures w14:val="standardContextual"/>
+              </w:rPr>
+              <w:t>Christmas Bonus</w:t>
             </w:r>
           </w:p>
         </w:tc>
@@ -6425,7 +6759,7 @@
                 <w:lang w:val="pl-PL" w:eastAsia="en-US" w:bidi="ar-SA"/>
                 <w14:ligatures w14:val="standardContextual"/>
               </w:rPr>
-              <w:t>(Odnosnie Passive Agressive) Gracz może klikać, ale efekt wydobywania zwiększa się wolniej.</w:t>
+              <w:t>(Odnosnie Passive Agressive) efekt wpływa na wszystkie fabryki.</w:t>
             </w:r>
           </w:p>
         </w:tc>
@@ -6477,92 +6811,6 @@
                 <w:lang w:val="pl-PL" w:eastAsia="en-US" w:bidi="ar-SA"/>
                 <w14:ligatures w14:val="standardContextual"/>
               </w:rPr>
-              <w:t>Christmas Bonus</w:t>
-            </w:r>
-          </w:p>
-        </w:tc>
-        <w:tc>
-          <w:tcPr>
-            <w:tcW w:w="5341" w:type="dxa"/>
-          </w:tcPr>
-          <w:p>
-            <w:pPr>
-              <w:widowControl w:val="0"/>
-              <w:jc w:val="both"/>
-              <w:rPr>
-                <w:rFonts w:hint="default" w:ascii="Calibri" w:hAnsi="Calibri" w:eastAsia="等线 Light" w:cs="Calibri"/>
-                <w:color w:val="auto"/>
-                <w:kern w:val="2"/>
-                <w:sz w:val="28"/>
-                <w:szCs w:val="28"/>
-                <w:vertAlign w:val="baseline"/>
-                <w:lang w:val="pl-PL" w:eastAsia="en-US" w:bidi="ar-SA"/>
-                <w14:ligatures w14:val="standardContextual"/>
-              </w:rPr>
-            </w:pPr>
-            <w:r>
-              <w:rPr>
-                <w:rFonts w:hint="default" w:ascii="Calibri" w:hAnsi="Calibri" w:eastAsia="等线 Light" w:cs="Calibri"/>
-                <w:color w:val="auto"/>
-                <w:kern w:val="2"/>
-                <w:sz w:val="28"/>
-                <w:szCs w:val="28"/>
-                <w:vertAlign w:val="baseline"/>
-                <w:lang w:val="pl-PL" w:eastAsia="en-US" w:bidi="ar-SA"/>
-                <w14:ligatures w14:val="standardContextual"/>
-              </w:rPr>
-              <w:t>(Odnosnie Passive Agressive) efekt wpływa na wszystkie fabryki.</w:t>
-            </w:r>
-          </w:p>
-        </w:tc>
-      </w:tr>
-      <w:tr>
-        <w:tblPrEx>
-          <w:tblBorders>
-            <w:top w:val="single" w:color="auto" w:sz="4" w:space="0"/>
-            <w:left w:val="single" w:color="auto" w:sz="4" w:space="0"/>
-            <w:bottom w:val="single" w:color="auto" w:sz="4" w:space="0"/>
-            <w:right w:val="single" w:color="auto" w:sz="4" w:space="0"/>
-            <w:insideH w:val="single" w:color="auto" w:sz="4" w:space="0"/>
-            <w:insideV w:val="single" w:color="auto" w:sz="4" w:space="0"/>
-          </w:tblBorders>
-          <w:tblCellMar>
-            <w:top w:w="0" w:type="dxa"/>
-            <w:left w:w="108" w:type="dxa"/>
-            <w:bottom w:w="0" w:type="dxa"/>
-            <w:right w:w="108" w:type="dxa"/>
-          </w:tblCellMar>
-        </w:tblPrEx>
-        <w:tc>
-          <w:tcPr>
-            <w:tcW w:w="5341" w:type="dxa"/>
-          </w:tcPr>
-          <w:p>
-            <w:pPr>
-              <w:widowControl w:val="0"/>
-              <w:jc w:val="both"/>
-              <w:rPr>
-                <w:rFonts w:hint="default" w:ascii="Calibri" w:hAnsi="Calibri" w:eastAsia="等线 Light" w:cs="Calibri"/>
-                <w:color w:val="auto"/>
-                <w:kern w:val="2"/>
-                <w:sz w:val="28"/>
-                <w:szCs w:val="28"/>
-                <w:vertAlign w:val="baseline"/>
-                <w:lang w:val="pl-PL" w:eastAsia="en-US" w:bidi="ar-SA"/>
-                <w14:ligatures w14:val="standardContextual"/>
-              </w:rPr>
-            </w:pPr>
-            <w:r>
-              <w:rPr>
-                <w:rFonts w:hint="default" w:ascii="Calibri" w:hAnsi="Calibri" w:eastAsia="等线 Light" w:cs="Calibri"/>
-                <w:color w:val="auto"/>
-                <w:kern w:val="2"/>
-                <w:sz w:val="28"/>
-                <w:szCs w:val="28"/>
-                <w:vertAlign w:val="baseline"/>
-                <w:lang w:val="pl-PL" w:eastAsia="en-US" w:bidi="ar-SA"/>
-                <w14:ligatures w14:val="standardContextual"/>
-              </w:rPr>
               <w:t>Hungry Wolf</w:t>
             </w:r>
           </w:p>
@@ -6627,31 +6875,6 @@
     <w:p>
       <w:pPr>
         <w:rPr>
-          <w:rFonts w:hint="default" w:ascii="Calibri" w:hAnsi="Calibri" w:eastAsia="等线 Light" w:cs="Calibri"/>
-          <w:color w:val="auto"/>
-          <w:kern w:val="2"/>
-          <w:sz w:val="28"/>
-          <w:szCs w:val="28"/>
-          <w:lang w:val="pl-PL" w:eastAsia="en-US" w:bidi="ar-SA"/>
-          <w14:ligatures w14:val="standardContextual"/>
-        </w:rPr>
-      </w:pPr>
-      <w:r>
-        <w:rPr>
-          <w:rFonts w:hint="default" w:ascii="Calibri" w:hAnsi="Calibri" w:eastAsia="等线 Light" w:cs="Calibri"/>
-          <w:color w:val="auto"/>
-          <w:kern w:val="2"/>
-          <w:sz w:val="28"/>
-          <w:szCs w:val="28"/>
-          <w:lang w:val="pl-PL" w:eastAsia="en-US" w:bidi="ar-SA"/>
-          <w14:ligatures w14:val="standardContextual"/>
-        </w:rPr>
-        <w:br w:type="page"/>
-      </w:r>
-    </w:p>
-    <w:p>
-      <w:pPr>
-        <w:rPr>
           <w:rFonts w:hint="default" w:ascii="Calibri Light" w:hAnsi="Calibri Light" w:eastAsia="等线 Light" w:cs="Times New Roman"/>
           <w:color w:val="F4B183" w:themeColor="accent2" w:themeTint="99"/>
           <w:kern w:val="2"/>
@@ -6669,7 +6892,9 @@
           <w14:ligatures w14:val="standardContextual"/>
         </w:rPr>
       </w:pPr>
-      <w:r>
+    </w:p>
+    <w:p>
+      <w:pPr>
         <w:rPr>
           <w:rFonts w:hint="default" w:ascii="Calibri Light" w:hAnsi="Calibri Light" w:eastAsia="等线 Light" w:cs="Times New Roman"/>
           <w:color w:val="F4B183" w:themeColor="accent2" w:themeTint="99"/>
@@ -6687,18 +6912,66 @@
           </w14:textFill>
           <w14:ligatures w14:val="standardContextual"/>
         </w:rPr>
-        <w:t>Jack of all Clicks</w:t>
-      </w:r>
-    </w:p>
-    <w:p>
-      <w:pPr>
-        <w:rPr>
-          <w:rFonts w:hint="default" w:ascii="Calibri" w:hAnsi="Calibri" w:eastAsia="等线 Light" w:cs="Calibri"/>
-          <w:color w:val="auto"/>
+      </w:pPr>
+    </w:p>
+    <w:p>
+      <w:pPr>
+        <w:rPr>
+          <w:rFonts w:hint="default" w:ascii="Calibri Light" w:hAnsi="Calibri Light" w:eastAsia="等线 Light" w:cs="Times New Roman"/>
+          <w:color w:val="F4B183" w:themeColor="accent2" w:themeTint="99"/>
           <w:kern w:val="2"/>
           <w:sz w:val="28"/>
           <w:szCs w:val="28"/>
           <w:lang w:val="pl-PL" w:eastAsia="en-US" w:bidi="ar-SA"/>
+          <w14:textFill>
+            <w14:solidFill>
+              <w14:schemeClr w14:val="accent2">
+                <w14:lumMod w14:val="60000"/>
+                <w14:lumOff w14:val="40000"/>
+              </w14:schemeClr>
+            </w14:solidFill>
+          </w14:textFill>
+          <w14:ligatures w14:val="standardContextual"/>
+        </w:rPr>
+      </w:pPr>
+      <w:r>
+        <w:rPr>
+          <w:rFonts w:hint="default" w:ascii="Calibri Light" w:hAnsi="Calibri Light" w:eastAsia="等线 Light" w:cs="Times New Roman"/>
+          <w:color w:val="F4B183" w:themeColor="accent2" w:themeTint="99"/>
+          <w:kern w:val="2"/>
+          <w:sz w:val="28"/>
+          <w:szCs w:val="28"/>
+          <w:lang w:val="pl-PL" w:eastAsia="en-US" w:bidi="ar-SA"/>
+          <w14:textFill>
+            <w14:solidFill>
+              <w14:schemeClr w14:val="accent2">
+                <w14:lumMod w14:val="60000"/>
+                <w14:lumOff w14:val="40000"/>
+              </w14:schemeClr>
+            </w14:solidFill>
+          </w14:textFill>
+          <w14:ligatures w14:val="standardContextual"/>
+        </w:rPr>
+        <w:t>Jack of all Clicks</w:t>
+      </w:r>
+    </w:p>
+    <w:p>
+      <w:pPr>
+        <w:rPr>
+          <w:rFonts w:hint="default" w:ascii="Calibri Light" w:hAnsi="Calibri Light" w:eastAsia="等线 Light" w:cs="Times New Roman"/>
+          <w:color w:val="F4B183" w:themeColor="accent2" w:themeTint="99"/>
+          <w:kern w:val="2"/>
+          <w:sz w:val="28"/>
+          <w:szCs w:val="28"/>
+          <w:lang w:val="pl-PL" w:eastAsia="en-US" w:bidi="ar-SA"/>
+          <w14:textFill>
+            <w14:solidFill>
+              <w14:schemeClr w14:val="accent2">
+                <w14:lumMod w14:val="60000"/>
+                <w14:lumOff w14:val="40000"/>
+              </w14:schemeClr>
+            </w14:solidFill>
+          </w14:textFill>
           <w14:ligatures w14:val="standardContextual"/>
         </w:rPr>
       </w:pPr>
@@ -9998,6 +10271,12 @@
             <w:insideH w:val="single" w:color="auto" w:sz="4" w:space="0"/>
             <w:insideV w:val="single" w:color="auto" w:sz="4" w:space="0"/>
           </w:tblBorders>
+          <w:tblCellMar>
+            <w:top w:w="0" w:type="dxa"/>
+            <w:left w:w="108" w:type="dxa"/>
+            <w:bottom w:w="0" w:type="dxa"/>
+            <w:right w:w="108" w:type="dxa"/>
+          </w:tblCellMar>
         </w:tblPrEx>
         <w:tc>
           <w:tcPr>

</xml_diff>